<commit_message>
Bilancio di genere 2025: memoria delle richieste, esoneri e nota Fondazione
Co-Authored-By: Claude Opus 5.5 <noreply@anthropic.com>
Claude-Session: https://claude.ai/code/session_01NPYDoU6nrtRE59is9BWqYg
</commit_message>
<xml_diff>
--- a/bilancio-genere-forli/bilancio-2025/Bilancio_di_genere_2025_ODCEC_Forli_BOZZA.docx
+++ b/bilancio-genere-forli/bilancio-2025/Bilancio_di_genere_2025_ODCEC_Forli_BOZZA.docx
@@ -84,7 +84,7 @@
           <w:sz w:val="22"/>
           <w:szCs w:val="22"/>
         </w:rPr>
-        <w:t xml:space="preserve">Le parti evidenziate in giallo aspettano i dati richiesti al Consiglio il 2/10/2026 (scadenza 31 ottobre) o il questionario agli iscritti.</w:t>
+        <w:t xml:space="preserve">Le parti evidenziate in giallo aspettano i dati richiesti all’Ordine il 28/9/2026 (scadenza 31 ottobre) o il questionario agli iscritti.</w:t>
       </w:r>
     </w:p>
     <w:p>
@@ -1067,7 +1067,7 @@
                 <w:sz w:val="19"/>
                 <w:szCs w:val="19"/>
               </w:rPr>
-              <w:t xml:space="preserve">Richieste del 2/10/2026</w:t>
+              <w:t xml:space="preserve">Richieste di settembre-ottobre 2026</w:t>
             </w:r>
           </w:p>
         </w:tc>
@@ -1629,7 +1629,7 @@
           <w:szCs w:val="22"/>
           <w:shd w:fill="FFE873" w:color="auto" w:val="clear"/>
         </w:rPr>
-        <w:t xml:space="preserve">[DA INTEGRARE: dato 6 della richiesta; se non assegnato, motivazione del Consiglio come chiedono le Linee guida]</w:t>
+        <w:t xml:space="preserve">[DA INTEGRARE: da chiedere al Consiglio; se non assegnato, motivazione come chiedono le Linee guida]</w:t>
       </w:r>
     </w:p>
     <w:p>
@@ -1812,7 +1812,7 @@
           <w:sz w:val="22"/>
           <w:szCs w:val="22"/>
         </w:rPr>
-        <w:t xml:space="preserve">Richiesta dati al Consiglio e, tramite l’Ordine, a Cassa Ragionieri, Tribunale, OCC Romagna e Camera di Commercio (2 ottobre 2026).</w:t>
+        <w:t xml:space="preserve">Richiesta dati all’Ordine e alla Fondazione (28 settembre 2026), call con la Presidente dell’Ordine (7 ottobre) e richieste a OCC Romagna (5 ottobre), Cassa Ragionieri, Tribunale e Camera di Commercio (12 ottobre).</w:t>
       </w:r>
     </w:p>
     <w:p>
@@ -8797,12 +8797,13 @@
             <w:r>
               <w:rPr>
                 <w:rFonts w:ascii="Verdana" w:cs="Verdana" w:eastAsia="Verdana" w:hAnsi="Verdana"/>
-                <w:color w:val="1F2A37"/>
-                <w:sz w:val="22"/>
-                <w:szCs w:val="22"/>
-                <w:shd w:fill="FFE873" w:color="auto" w:val="clear"/>
-              </w:rPr>
-              <w:t xml:space="preserve">[DA INTEGRARE: dato 5]</w:t>
+                <w:b w:val="false"/>
+                <w:bCs w:val="false"/>
+                <w:color w:val="1F2A37"/>
+                <w:sz w:val="19"/>
+                <w:szCs w:val="19"/>
+              </w:rPr>
+              <w:t xml:space="preserve">Maternità</w:t>
             </w:r>
           </w:p>
         </w:tc>
@@ -8826,7 +8827,7 @@
                 <w:sz w:val="19"/>
                 <w:szCs w:val="19"/>
               </w:rPr>
-              <w:t xml:space="preserve">…</w:t>
+              <w:t xml:space="preserve">1</w:t>
             </w:r>
           </w:p>
         </w:tc>
@@ -8850,7 +8851,161 @@
                 <w:sz w:val="19"/>
                 <w:szCs w:val="19"/>
               </w:rPr>
-              <w:t xml:space="preserve">…</w:t>
+              <w:t xml:space="preserve">0</w:t>
+            </w:r>
+          </w:p>
+        </w:tc>
+      </w:tr>
+      <w:tr>
+        <w:trPr>
+          <w:cantSplit/>
+        </w:trPr>
+        <w:tc>
+          <w:tcPr>
+            <w:tcW w:type="dxa" w:w="4000"/>
+            <w:tcMar>
+              <w:top w:type="dxa" w:w="70"/>
+              <w:left w:type="dxa" w:w="110"/>
+              <w:bottom w:type="dxa" w:w="70"/>
+              <w:right w:type="dxa" w:w="110"/>
+            </w:tcMar>
+          </w:tcPr>
+          <w:p>
+            <w:r>
+              <w:rPr>
+                <w:rFonts w:ascii="Verdana" w:cs="Verdana" w:eastAsia="Verdana" w:hAnsi="Verdana"/>
+                <w:b w:val="false"/>
+                <w:bCs w:val="false"/>
+                <w:color w:val="1F2A37"/>
+                <w:sz w:val="19"/>
+                <w:szCs w:val="19"/>
+              </w:rPr>
+              <w:t xml:space="preserve">Paternità</w:t>
+            </w:r>
+          </w:p>
+        </w:tc>
+        <w:tc>
+          <w:tcPr>
+            <w:tcW w:type="dxa" w:w="2500"/>
+            <w:tcMar>
+              <w:top w:type="dxa" w:w="70"/>
+              <w:left w:type="dxa" w:w="110"/>
+              <w:bottom w:type="dxa" w:w="70"/>
+              <w:right w:type="dxa" w:w="110"/>
+            </w:tcMar>
+          </w:tcPr>
+          <w:p>
+            <w:r>
+              <w:rPr>
+                <w:rFonts w:ascii="Verdana" w:cs="Verdana" w:eastAsia="Verdana" w:hAnsi="Verdana"/>
+                <w:b w:val="false"/>
+                <w:bCs w:val="false"/>
+                <w:color w:val="1F2A37"/>
+                <w:sz w:val="19"/>
+                <w:szCs w:val="19"/>
+              </w:rPr>
+              <w:t xml:space="preserve">0</w:t>
+            </w:r>
+          </w:p>
+        </w:tc>
+        <w:tc>
+          <w:tcPr>
+            <w:tcW w:type="dxa" w:w="2526"/>
+            <w:tcMar>
+              <w:top w:type="dxa" w:w="70"/>
+              <w:left w:type="dxa" w:w="110"/>
+              <w:bottom w:type="dxa" w:w="70"/>
+              <w:right w:type="dxa" w:w="110"/>
+            </w:tcMar>
+          </w:tcPr>
+          <w:p>
+            <w:r>
+              <w:rPr>
+                <w:rFonts w:ascii="Verdana" w:cs="Verdana" w:eastAsia="Verdana" w:hAnsi="Verdana"/>
+                <w:b w:val="false"/>
+                <w:bCs w:val="false"/>
+                <w:color w:val="1F2A37"/>
+                <w:sz w:val="19"/>
+                <w:szCs w:val="19"/>
+              </w:rPr>
+              <w:t xml:space="preserve">1</w:t>
+            </w:r>
+          </w:p>
+        </w:tc>
+      </w:tr>
+      <w:tr>
+        <w:trPr>
+          <w:cantSplit/>
+        </w:trPr>
+        <w:tc>
+          <w:tcPr>
+            <w:tcW w:type="dxa" w:w="4000"/>
+            <w:tcMar>
+              <w:top w:type="dxa" w:w="70"/>
+              <w:left w:type="dxa" w:w="110"/>
+              <w:bottom w:type="dxa" w:w="70"/>
+              <w:right w:type="dxa" w:w="110"/>
+            </w:tcMar>
+          </w:tcPr>
+          <w:p>
+            <w:r>
+              <w:rPr>
+                <w:rFonts w:ascii="Verdana" w:cs="Verdana" w:eastAsia="Verdana" w:hAnsi="Verdana"/>
+                <w:b w:val="false"/>
+                <w:bCs w:val="false"/>
+                <w:color w:val="1F2A37"/>
+                <w:sz w:val="19"/>
+                <w:szCs w:val="19"/>
+              </w:rPr>
+              <w:t xml:space="preserve">Cura di familiari</w:t>
+            </w:r>
+          </w:p>
+        </w:tc>
+        <w:tc>
+          <w:tcPr>
+            <w:tcW w:type="dxa" w:w="2500"/>
+            <w:tcMar>
+              <w:top w:type="dxa" w:w="70"/>
+              <w:left w:type="dxa" w:w="110"/>
+              <w:bottom w:type="dxa" w:w="70"/>
+              <w:right w:type="dxa" w:w="110"/>
+            </w:tcMar>
+          </w:tcPr>
+          <w:p>
+            <w:r>
+              <w:rPr>
+                <w:rFonts w:ascii="Verdana" w:cs="Verdana" w:eastAsia="Verdana" w:hAnsi="Verdana"/>
+                <w:b w:val="false"/>
+                <w:bCs w:val="false"/>
+                <w:color w:val="1F2A37"/>
+                <w:sz w:val="19"/>
+                <w:szCs w:val="19"/>
+              </w:rPr>
+              <w:t xml:space="preserve">0</w:t>
+            </w:r>
+          </w:p>
+        </w:tc>
+        <w:tc>
+          <w:tcPr>
+            <w:tcW w:type="dxa" w:w="2526"/>
+            <w:tcMar>
+              <w:top w:type="dxa" w:w="70"/>
+              <w:left w:type="dxa" w:w="110"/>
+              <w:bottom w:type="dxa" w:w="70"/>
+              <w:right w:type="dxa" w:w="110"/>
+            </w:tcMar>
+          </w:tcPr>
+          <w:p>
+            <w:r>
+              <w:rPr>
+                <w:rFonts w:ascii="Verdana" w:cs="Verdana" w:eastAsia="Verdana" w:hAnsi="Verdana"/>
+                <w:b w:val="false"/>
+                <w:bCs w:val="false"/>
+                <w:color w:val="1F2A37"/>
+                <w:sz w:val="19"/>
+                <w:szCs w:val="19"/>
+              </w:rPr>
+              <w:t xml:space="preserve">0</w:t>
             </w:r>
           </w:p>
         </w:tc>
@@ -9671,7 +9826,7 @@
           <w:sz w:val="22"/>
           <w:szCs w:val="22"/>
         </w:rPr>
-        <w:t xml:space="preserve">È il cuore del “gender budgeting” secondo il Consiglio d’Europa, ripreso dalle Linee guida, ma nei 17 bilanci di Ordini che abbiamo esaminato nessuno lo applica. Dividiamo le spese del consuntivo 2025 in tre gruppi:</w:t>
+        <w:t xml:space="preserve">È il cuore del “gender budgeting” secondo il Consiglio d’Europa, ripreso dalle Linee guida, ma nei 17 bilanci di Ordini che abbiamo esaminato nessuno lo applica. Dividiamo le spese 2025 dell’Ordine e della Fondazione in tre gruppi:</w:t>
       </w:r>
     </w:p>
     <w:p>
@@ -9709,7 +9864,7 @@
           <w:sz w:val="22"/>
           <w:szCs w:val="22"/>
         </w:rPr>
-        <w:t xml:space="preserve">sensibili: hanno effetti diversi su donne e uomini a seconda di come sono organizzate (formazione, eventi, servizi agli iscritti, comunicazione);</w:t>
+        <w:t xml:space="preserve">dirette a ridurre le diseguaglianze di genere: attività del CPO, progetti nelle scuole;</w:t>
       </w:r>
     </w:p>
     <w:p>
@@ -9728,7 +9883,21 @@
           <w:sz w:val="22"/>
           <w:szCs w:val="22"/>
         </w:rPr>
-        <w:t xml:space="preserve">dirette a ridurre le diseguaglianze: attività del CPO, agevolazioni per maternità e cura.</w:t>
+        <w:t xml:space="preserve">attività socio-culturali: visite guidate, eventi sportivi e altre iniziative per gli iscritti, da leggere guardando chi vi partecipa.</w:t>
+      </w:r>
+    </w:p>
+    <w:p>
+      <w:pPr>
+        <w:spacing w:after="140" w:line="360"/>
+      </w:pPr>
+      <w:r>
+        <w:rPr>
+          <w:rFonts w:ascii="Verdana" w:cs="Verdana" w:eastAsia="Verdana" w:hAnsi="Verdana"/>
+          <w:color w:val="1F2A37"/>
+          <w:sz w:val="22"/>
+          <w:szCs w:val="22"/>
+        </w:rPr>
+        <w:t xml:space="preserve">Fondazione: nel 2025 l’unica spesa per attività socio-culturali o sportive è l’iscrizione degli iscritti alla manifestazione “Diabetes” (importo da scheda contabile, da inserire). Non ci sono stati altri eventi culturali o sportivi.</w:t>
       </w:r>
     </w:p>
     <w:tbl>
@@ -9851,7 +10020,7 @@
                 <w:szCs w:val="22"/>
                 <w:shd w:fill="FFE873" w:color="auto" w:val="clear"/>
               </w:rPr>
-              <w:t xml:space="preserve">[DA INTEGRARE: dato 7, consuntivo per capitolo dalla Tesoriera]</w:t>
+              <w:t xml:space="preserve">[DA INTEGRARE: consuntivo 2025 per capitolo dalla Tesoriera]</w:t>
             </w:r>
           </w:p>
         </w:tc>
@@ -11123,7 +11292,7 @@
                 <w:sz w:val="19"/>
                 <w:szCs w:val="19"/>
               </w:rPr>
-              <w:t xml:space="preserve">in attesa</w:t>
+              <w:t xml:space="preserve">ricevuto 12/10, da inserire</w:t>
             </w:r>
           </w:p>
         </w:tc>
@@ -11224,7 +11393,7 @@
                 <w:sz w:val="19"/>
                 <w:szCs w:val="19"/>
               </w:rPr>
-              <w:t xml:space="preserve">in attesa</w:t>
+              <w:t xml:space="preserve">ricevuto 12/10, da inserire</w:t>
             </w:r>
           </w:p>
         </w:tc>
@@ -11325,7 +11494,7 @@
                 <w:sz w:val="19"/>
                 <w:szCs w:val="19"/>
               </w:rPr>
-              <w:t xml:space="preserve">in attesa</w:t>
+              <w:t xml:space="preserve">ricevuto 12/10, da inserire</w:t>
             </w:r>
           </w:p>
         </w:tc>
@@ -11426,7 +11595,7 @@
                 <w:sz w:val="19"/>
                 <w:szCs w:val="19"/>
               </w:rPr>
-              <w:t xml:space="preserve">in attesa</w:t>
+              <w:t xml:space="preserve">ricevuto 12/10, da inserire</w:t>
             </w:r>
           </w:p>
         </w:tc>
@@ -11527,7 +11696,7 @@
                 <w:sz w:val="19"/>
                 <w:szCs w:val="19"/>
               </w:rPr>
-              <w:t xml:space="preserve">in attesa</w:t>
+              <w:t xml:space="preserve">inserito</w:t>
             </w:r>
           </w:p>
         </w:tc>
@@ -11580,7 +11749,7 @@
                 <w:sz w:val="19"/>
                 <w:szCs w:val="19"/>
               </w:rPr>
-              <w:t xml:space="preserve">Budget CPO</w:t>
+              <w:t xml:space="preserve">Consuntivo 2025 per capitolo</w:t>
             </w:r>
           </w:p>
         </w:tc>
@@ -11604,7 +11773,7 @@
                 <w:sz w:val="19"/>
                 <w:szCs w:val="19"/>
               </w:rPr>
-              <w:t xml:space="preserve">Consiglio</w:t>
+              <w:t xml:space="preserve">Tesoriera</w:t>
             </w:r>
           </w:p>
         </w:tc>
@@ -11681,7 +11850,7 @@
                 <w:sz w:val="19"/>
                 <w:szCs w:val="19"/>
               </w:rPr>
-              <w:t xml:space="preserve">Consuntivo 2025 per capitolo</w:t>
+              <w:t xml:space="preserve">Spese socio-culturali della Fondazione</w:t>
             </w:r>
           </w:p>
         </w:tc>
@@ -11705,7 +11874,7 @@
                 <w:sz w:val="19"/>
                 <w:szCs w:val="19"/>
               </w:rPr>
-              <w:t xml:space="preserve">Tesoriera</w:t>
+              <w:t xml:space="preserve">Fondazione</w:t>
             </w:r>
           </w:p>
         </w:tc>
@@ -11729,7 +11898,7 @@
                 <w:sz w:val="19"/>
                 <w:szCs w:val="19"/>
               </w:rPr>
-              <w:t xml:space="preserve">in attesa</w:t>
+              <w:t xml:space="preserve">inserito</w:t>
             </w:r>
           </w:p>
         </w:tc>

</xml_diff>

<commit_message>
Bilancio di genere 2025: inseriti dati Segreteria (serie, flussi, organi, commissioni, eventi), memoria aggiornata
Co-Authored-By: Claude Opus 5.5 <noreply@anthropic.com>
Claude-Session: https://claude.ai/code/session_01NPYDoU6nrtRE59is9BWqYg
</commit_message>
<xml_diff>
--- a/bilancio-genere-forli/bilancio-2025/Bilancio_di_genere_2025_ODCEC_Forli_BOZZA.docx
+++ b/bilancio-genere-forli/bilancio-2025/Bilancio_di_genere_2025_ODCEC_Forli_BOZZA.docx
@@ -148,7 +148,7 @@
           <w:sz w:val="25"/>
           <w:szCs w:val="25"/>
         </w:rPr>
-        <w:t xml:space="preserve">Il 2025 in cinque numeri</w:t>
+        <w:t xml:space="preserve">Il 2025 in sei numeri</w:t>
       </w:r>
     </w:p>
     <w:tbl>
@@ -458,7 +458,7 @@
                 <w:sz w:val="24"/>
                 <w:szCs w:val="24"/>
               </w:rPr>
-              <w:t xml:space="preserve">4 su 11</w:t>
+              <w:t xml:space="preserve">3 su 4</w:t>
             </w:r>
           </w:p>
         </w:tc>
@@ -482,7 +482,60 @@
                 <w:sz w:val="19"/>
                 <w:szCs w:val="19"/>
               </w:rPr>
-              <w:t xml:space="preserve">le donne nel Consiglio 2022-2025. Il Consiglio 2026-2030 è presieduto da una donna.</w:t>
+              <w:t xml:space="preserve">le cariche del Consiglio 2026-2030 affidate a donne: Presidente, Segretaria, Tesoriera. Nel Consiglio le donne sono 5 su 11.</w:t>
+            </w:r>
+          </w:p>
+        </w:tc>
+      </w:tr>
+      <w:tr>
+        <w:trPr>
+          <w:cantSplit/>
+        </w:trPr>
+        <w:tc>
+          <w:tcPr>
+            <w:tcW w:type="dxa" w:w="2000"/>
+            <w:tcMar>
+              <w:top w:type="dxa" w:w="70"/>
+              <w:left w:type="dxa" w:w="110"/>
+              <w:bottom w:type="dxa" w:w="70"/>
+              <w:right w:type="dxa" w:w="110"/>
+            </w:tcMar>
+          </w:tcPr>
+          <w:p>
+            <w:r>
+              <w:rPr>
+                <w:rFonts w:ascii="Verdana" w:cs="Verdana" w:eastAsia="Verdana" w:hAnsi="Verdana"/>
+                <w:b/>
+                <w:bCs/>
+                <w:color w:val="1F2A37"/>
+                <w:sz w:val="24"/>
+                <w:szCs w:val="24"/>
+              </w:rPr>
+              <w:t xml:space="preserve">27,7%</w:t>
+            </w:r>
+          </w:p>
+        </w:tc>
+        <w:tc>
+          <w:tcPr>
+            <w:tcW w:type="dxa" w:w="7026"/>
+            <w:tcMar>
+              <w:top w:type="dxa" w:w="70"/>
+              <w:left w:type="dxa" w:w="110"/>
+              <w:bottom w:type="dxa" w:w="70"/>
+              <w:right w:type="dxa" w:w="110"/>
+            </w:tcMar>
+          </w:tcPr>
+          <w:p>
+            <w:r>
+              <w:rPr>
+                <w:rFonts w:ascii="Verdana" w:cs="Verdana" w:eastAsia="Verdana" w:hAnsi="Verdana"/>
+                <w:b w:val="false"/>
+                <w:bCs w:val="false"/>
+                <w:color w:val="1F2A37"/>
+                <w:sz w:val="19"/>
+                <w:szCs w:val="19"/>
+              </w:rPr>
+              <w:t xml:space="preserve">le relatrici negli eventi formativi del 2025: poco più di una su quattro.</w:t>
             </w:r>
           </w:p>
         </w:tc>
@@ -499,7 +552,7 @@
           <w:sz w:val="18"/>
           <w:szCs w:val="18"/>
         </w:rPr>
-        <w:t xml:space="preserve">Nota: il primo, il terzo e il quinto numero si riferiscono al 31/12/2025; il divario di reddito ai redditi 2024 comunicati alla Cassa nel 2025.</w:t>
+        <w:t xml:space="preserve">Nota: iscritti e praticanti al 31/12/2025; divario di reddito sui redditi 2024 comunicati alla Cassa nel 2025; Consiglio in carica dal 23/2/2026.</w:t>
       </w:r>
     </w:p>
     <w:p>
@@ -1364,7 +1417,7 @@
           <w:sz w:val="22"/>
           <w:szCs w:val="22"/>
         </w:rPr>
-        <w:t xml:space="preserve">Il Comitato in carica è stato nominato dal Consiglio dell’Ordine il 23 febbraio 2026 per il quadriennio 2026-2030. È composto da 7 persone: 5 donne e 2 uomini.</w:t>
+        <w:t xml:space="preserve">Il Comitato in carica è stato nominato dal Consiglio dell’Ordine il 23 febbraio 2026 per il quadriennio 2026-2030. È composto da 7 persone: 6 donne e 1 uomini.</w:t>
       </w:r>
     </w:p>
     <w:tbl>
@@ -1509,12 +1562,13 @@
             <w:r>
               <w:rPr>
                 <w:rFonts w:ascii="Verdana" w:cs="Verdana" w:eastAsia="Verdana" w:hAnsi="Verdana"/>
-                <w:color w:val="1F2A37"/>
-                <w:sz w:val="22"/>
-                <w:szCs w:val="22"/>
-                <w:shd w:fill="FFE873" w:color="auto" w:val="clear"/>
-              </w:rPr>
-              <w:t xml:space="preserve">[DA INTEGRARE: altri 6 componenti e ruoli]</w:t>
+                <w:b w:val="false"/>
+                <w:bCs w:val="false"/>
+                <w:color w:val="1F2A37"/>
+                <w:sz w:val="19"/>
+                <w:szCs w:val="19"/>
+              </w:rPr>
+              <w:t xml:space="preserve">Monica Orecchioni</w:t>
             </w:r>
           </w:p>
         </w:tc>
@@ -1538,7 +1592,272 @@
                 <w:sz w:val="19"/>
                 <w:szCs w:val="19"/>
               </w:rPr>
-              <w:t xml:space="preserve">…</w:t>
+              <w:t xml:space="preserve">Vicepresidente</w:t>
+            </w:r>
+          </w:p>
+        </w:tc>
+      </w:tr>
+      <w:tr>
+        <w:trPr>
+          <w:cantSplit/>
+        </w:trPr>
+        <w:tc>
+          <w:tcPr>
+            <w:tcW w:type="dxa" w:w="5000"/>
+            <w:tcMar>
+              <w:top w:type="dxa" w:w="70"/>
+              <w:left w:type="dxa" w:w="110"/>
+              <w:bottom w:type="dxa" w:w="70"/>
+              <w:right w:type="dxa" w:w="110"/>
+            </w:tcMar>
+          </w:tcPr>
+          <w:p>
+            <w:r>
+              <w:rPr>
+                <w:rFonts w:ascii="Verdana" w:cs="Verdana" w:eastAsia="Verdana" w:hAnsi="Verdana"/>
+                <w:b w:val="false"/>
+                <w:bCs w:val="false"/>
+                <w:color w:val="1F2A37"/>
+                <w:sz w:val="19"/>
+                <w:szCs w:val="19"/>
+              </w:rPr>
+              <w:t xml:space="preserve">Debora Bonavita</w:t>
+            </w:r>
+          </w:p>
+        </w:tc>
+        <w:tc>
+          <w:tcPr>
+            <w:tcW w:type="dxa" w:w="4026"/>
+            <w:tcMar>
+              <w:top w:type="dxa" w:w="70"/>
+              <w:left w:type="dxa" w:w="110"/>
+              <w:bottom w:type="dxa" w:w="70"/>
+              <w:right w:type="dxa" w:w="110"/>
+            </w:tcMar>
+          </w:tcPr>
+          <w:p>
+            <w:r>
+              <w:rPr>
+                <w:rFonts w:ascii="Verdana" w:cs="Verdana" w:eastAsia="Verdana" w:hAnsi="Verdana"/>
+                <w:b w:val="false"/>
+                <w:bCs w:val="false"/>
+                <w:color w:val="1F2A37"/>
+                <w:sz w:val="19"/>
+                <w:szCs w:val="19"/>
+              </w:rPr>
+              <w:t xml:space="preserve">Segretaria</w:t>
+            </w:r>
+          </w:p>
+        </w:tc>
+      </w:tr>
+      <w:tr>
+        <w:trPr>
+          <w:cantSplit/>
+        </w:trPr>
+        <w:tc>
+          <w:tcPr>
+            <w:tcW w:type="dxa" w:w="5000"/>
+            <w:tcMar>
+              <w:top w:type="dxa" w:w="70"/>
+              <w:left w:type="dxa" w:w="110"/>
+              <w:bottom w:type="dxa" w:w="70"/>
+              <w:right w:type="dxa" w:w="110"/>
+            </w:tcMar>
+          </w:tcPr>
+          <w:p>
+            <w:r>
+              <w:rPr>
+                <w:rFonts w:ascii="Verdana" w:cs="Verdana" w:eastAsia="Verdana" w:hAnsi="Verdana"/>
+                <w:b w:val="false"/>
+                <w:bCs w:val="false"/>
+                <w:color w:val="1F2A37"/>
+                <w:sz w:val="19"/>
+                <w:szCs w:val="19"/>
+              </w:rPr>
+              <w:t xml:space="preserve">Roberta Fabbri</w:t>
+            </w:r>
+          </w:p>
+        </w:tc>
+        <w:tc>
+          <w:tcPr>
+            <w:tcW w:type="dxa" w:w="4026"/>
+            <w:tcMar>
+              <w:top w:type="dxa" w:w="70"/>
+              <w:left w:type="dxa" w:w="110"/>
+              <w:bottom w:type="dxa" w:w="70"/>
+              <w:right w:type="dxa" w:w="110"/>
+            </w:tcMar>
+          </w:tcPr>
+          <w:p>
+            <w:r>
+              <w:rPr>
+                <w:rFonts w:ascii="Verdana" w:cs="Verdana" w:eastAsia="Verdana" w:hAnsi="Verdana"/>
+                <w:b w:val="false"/>
+                <w:bCs w:val="false"/>
+                <w:color w:val="1F2A37"/>
+                <w:sz w:val="19"/>
+                <w:szCs w:val="19"/>
+              </w:rPr>
+              <w:t xml:space="preserve">Componente</w:t>
+            </w:r>
+          </w:p>
+        </w:tc>
+      </w:tr>
+      <w:tr>
+        <w:trPr>
+          <w:cantSplit/>
+        </w:trPr>
+        <w:tc>
+          <w:tcPr>
+            <w:tcW w:type="dxa" w:w="5000"/>
+            <w:tcMar>
+              <w:top w:type="dxa" w:w="70"/>
+              <w:left w:type="dxa" w:w="110"/>
+              <w:bottom w:type="dxa" w:w="70"/>
+              <w:right w:type="dxa" w:w="110"/>
+            </w:tcMar>
+          </w:tcPr>
+          <w:p>
+            <w:r>
+              <w:rPr>
+                <w:rFonts w:ascii="Verdana" w:cs="Verdana" w:eastAsia="Verdana" w:hAnsi="Verdana"/>
+                <w:b w:val="false"/>
+                <w:bCs w:val="false"/>
+                <w:color w:val="1F2A37"/>
+                <w:sz w:val="19"/>
+                <w:szCs w:val="19"/>
+              </w:rPr>
+              <w:t xml:space="preserve">Lucia Camporesi</w:t>
+            </w:r>
+          </w:p>
+        </w:tc>
+        <w:tc>
+          <w:tcPr>
+            <w:tcW w:type="dxa" w:w="4026"/>
+            <w:tcMar>
+              <w:top w:type="dxa" w:w="70"/>
+              <w:left w:type="dxa" w:w="110"/>
+              <w:bottom w:type="dxa" w:w="70"/>
+              <w:right w:type="dxa" w:w="110"/>
+            </w:tcMar>
+          </w:tcPr>
+          <w:p>
+            <w:r>
+              <w:rPr>
+                <w:rFonts w:ascii="Verdana" w:cs="Verdana" w:eastAsia="Verdana" w:hAnsi="Verdana"/>
+                <w:b w:val="false"/>
+                <w:bCs w:val="false"/>
+                <w:color w:val="1F2A37"/>
+                <w:sz w:val="19"/>
+                <w:szCs w:val="19"/>
+              </w:rPr>
+              <w:t xml:space="preserve">Componente</w:t>
+            </w:r>
+          </w:p>
+        </w:tc>
+      </w:tr>
+      <w:tr>
+        <w:trPr>
+          <w:cantSplit/>
+        </w:trPr>
+        <w:tc>
+          <w:tcPr>
+            <w:tcW w:type="dxa" w:w="5000"/>
+            <w:tcMar>
+              <w:top w:type="dxa" w:w="70"/>
+              <w:left w:type="dxa" w:w="110"/>
+              <w:bottom w:type="dxa" w:w="70"/>
+              <w:right w:type="dxa" w:w="110"/>
+            </w:tcMar>
+          </w:tcPr>
+          <w:p>
+            <w:r>
+              <w:rPr>
+                <w:rFonts w:ascii="Verdana" w:cs="Verdana" w:eastAsia="Verdana" w:hAnsi="Verdana"/>
+                <w:b w:val="false"/>
+                <w:bCs w:val="false"/>
+                <w:color w:val="1F2A37"/>
+                <w:sz w:val="19"/>
+                <w:szCs w:val="19"/>
+              </w:rPr>
+              <w:t xml:space="preserve">Francesco Samorì</w:t>
+            </w:r>
+          </w:p>
+        </w:tc>
+        <w:tc>
+          <w:tcPr>
+            <w:tcW w:type="dxa" w:w="4026"/>
+            <w:tcMar>
+              <w:top w:type="dxa" w:w="70"/>
+              <w:left w:type="dxa" w:w="110"/>
+              <w:bottom w:type="dxa" w:w="70"/>
+              <w:right w:type="dxa" w:w="110"/>
+            </w:tcMar>
+          </w:tcPr>
+          <w:p>
+            <w:r>
+              <w:rPr>
+                <w:rFonts w:ascii="Verdana" w:cs="Verdana" w:eastAsia="Verdana" w:hAnsi="Verdana"/>
+                <w:b w:val="false"/>
+                <w:bCs w:val="false"/>
+                <w:color w:val="1F2A37"/>
+                <w:sz w:val="19"/>
+                <w:szCs w:val="19"/>
+              </w:rPr>
+              <w:t xml:space="preserve">Componente</w:t>
+            </w:r>
+          </w:p>
+        </w:tc>
+      </w:tr>
+      <w:tr>
+        <w:trPr>
+          <w:cantSplit/>
+        </w:trPr>
+        <w:tc>
+          <w:tcPr>
+            <w:tcW w:type="dxa" w:w="5000"/>
+            <w:tcMar>
+              <w:top w:type="dxa" w:w="70"/>
+              <w:left w:type="dxa" w:w="110"/>
+              <w:bottom w:type="dxa" w:w="70"/>
+              <w:right w:type="dxa" w:w="110"/>
+            </w:tcMar>
+          </w:tcPr>
+          <w:p>
+            <w:r>
+              <w:rPr>
+                <w:rFonts w:ascii="Verdana" w:cs="Verdana" w:eastAsia="Verdana" w:hAnsi="Verdana"/>
+                <w:b w:val="false"/>
+                <w:bCs w:val="false"/>
+                <w:color w:val="1F2A37"/>
+                <w:sz w:val="19"/>
+                <w:szCs w:val="19"/>
+              </w:rPr>
+              <w:t xml:space="preserve">Gianluca Zavagli</w:t>
+            </w:r>
+          </w:p>
+        </w:tc>
+        <w:tc>
+          <w:tcPr>
+            <w:tcW w:type="dxa" w:w="4026"/>
+            <w:tcMar>
+              <w:top w:type="dxa" w:w="70"/>
+              <w:left w:type="dxa" w:w="110"/>
+              <w:bottom w:type="dxa" w:w="70"/>
+              <w:right w:type="dxa" w:w="110"/>
+            </w:tcMar>
+          </w:tcPr>
+          <w:p>
+            <w:r>
+              <w:rPr>
+                <w:rFonts w:ascii="Verdana" w:cs="Verdana" w:eastAsia="Verdana" w:hAnsi="Verdana"/>
+                <w:b w:val="false"/>
+                <w:bCs w:val="false"/>
+                <w:color w:val="1F2A37"/>
+                <w:sz w:val="19"/>
+                <w:szCs w:val="19"/>
+              </w:rPr>
+              <w:t xml:space="preserve">Componente</w:t>
             </w:r>
           </w:p>
         </w:tc>
@@ -2779,7 +3098,7 @@
                 <w:sz w:val="19"/>
                 <w:szCs w:val="19"/>
               </w:rPr>
-              <w:t xml:space="preserve">…</w:t>
+              <w:t xml:space="preserve">—</w:t>
             </w:r>
           </w:p>
         </w:tc>
@@ -2898,12 +3217,13 @@
             <w:r>
               <w:rPr>
                 <w:rFonts w:ascii="Verdana" w:cs="Verdana" w:eastAsia="Verdana" w:hAnsi="Verdana"/>
-                <w:color w:val="1F2A37"/>
-                <w:sz w:val="22"/>
-                <w:szCs w:val="22"/>
-                <w:shd w:fill="FFE873" w:color="auto" w:val="clear"/>
-              </w:rPr>
-              <w:t xml:space="preserve">[DA INTEGRARE: dato 2]</w:t>
+                <w:b w:val="false"/>
+                <w:bCs w:val="false"/>
+                <w:color w:val="1F2A37"/>
+                <w:sz w:val="19"/>
+                <w:szCs w:val="19"/>
+              </w:rPr>
+              <w:t xml:space="preserve">292</w:t>
             </w:r>
           </w:p>
         </w:tc>
@@ -2927,7 +3247,7 @@
                 <w:sz w:val="19"/>
                 <w:szCs w:val="19"/>
               </w:rPr>
-              <w:t xml:space="preserve">…</w:t>
+              <w:t xml:space="preserve">44,9%</w:t>
             </w:r>
           </w:p>
         </w:tc>
@@ -3046,12 +3366,13 @@
             <w:r>
               <w:rPr>
                 <w:rFonts w:ascii="Verdana" w:cs="Verdana" w:eastAsia="Verdana" w:hAnsi="Verdana"/>
-                <w:color w:val="1F2A37"/>
-                <w:sz w:val="22"/>
-                <w:szCs w:val="22"/>
-                <w:shd w:fill="FFE873" w:color="auto" w:val="clear"/>
-              </w:rPr>
-              <w:t xml:space="preserve">[DA INTEGRARE: dato 2]</w:t>
+                <w:b w:val="false"/>
+                <w:bCs w:val="false"/>
+                <w:color w:val="1F2A37"/>
+                <w:sz w:val="19"/>
+                <w:szCs w:val="19"/>
+              </w:rPr>
+              <w:t xml:space="preserve">296</w:t>
             </w:r>
           </w:p>
         </w:tc>
@@ -3075,7 +3396,7 @@
                 <w:sz w:val="19"/>
                 <w:szCs w:val="19"/>
               </w:rPr>
-              <w:t xml:space="preserve">…</w:t>
+              <w:t xml:space="preserve">45,5%</w:t>
             </w:r>
           </w:p>
         </w:tc>
@@ -3528,6 +3849,20 @@
         </w:tc>
       </w:tr>
     </w:tbl>
+    <w:p>
+      <w:pPr>
+        <w:spacing w:after="140" w:line="360"/>
+      </w:pPr>
+      <w:r>
+        <w:rPr>
+          <w:rFonts w:ascii="Verdana" w:cs="Verdana" w:eastAsia="Verdana" w:hAnsi="Verdana"/>
+          <w:color w:val="1F2A37"/>
+          <w:sz w:val="22"/>
+          <w:szCs w:val="22"/>
+        </w:rPr>
+        <w:t xml:space="preserve">In cinque anni la quota di donne è passata dal 44,9% al 45,7%, con un massimo del 46,2% nel 2024. Gli iscritti sono rimasti stabili intorno ai 650: le donne sono la stessa cifra di cinque anni fa (292), gli uomini sono 12 in meno.</w:t>
+      </w:r>
+    </w:p>
     <w:p>
       <w:pPr>
         <w:pStyle w:val="Heading2"/>
@@ -4995,12 +5330,13 @@
             <w:r>
               <w:rPr>
                 <w:rFonts w:ascii="Verdana" w:cs="Verdana" w:eastAsia="Verdana" w:hAnsi="Verdana"/>
-                <w:color w:val="1F2A37"/>
-                <w:sz w:val="22"/>
-                <w:szCs w:val="22"/>
-                <w:shd w:fill="FFE873" w:color="auto" w:val="clear"/>
-              </w:rPr>
-              <w:t xml:space="preserve">[DA INTEGRARE: dato 2]</w:t>
+                <w:b w:val="false"/>
+                <w:bCs w:val="false"/>
+                <w:color w:val="1F2A37"/>
+                <w:sz w:val="19"/>
+                <w:szCs w:val="19"/>
+              </w:rPr>
+              <w:t xml:space="preserve">—</w:t>
             </w:r>
           </w:p>
         </w:tc>
@@ -5024,7 +5360,7 @@
                 <w:sz w:val="19"/>
                 <w:szCs w:val="19"/>
               </w:rPr>
-              <w:t xml:space="preserve">…</w:t>
+              <w:t xml:space="preserve">—</w:t>
             </w:r>
           </w:p>
         </w:tc>
@@ -5048,7 +5384,7 @@
                 <w:sz w:val="19"/>
                 <w:szCs w:val="19"/>
               </w:rPr>
-              <w:t xml:space="preserve">…</w:t>
+              <w:t xml:space="preserve">—</w:t>
             </w:r>
           </w:p>
         </w:tc>
@@ -5119,12 +5455,13 @@
             <w:r>
               <w:rPr>
                 <w:rFonts w:ascii="Verdana" w:cs="Verdana" w:eastAsia="Verdana" w:hAnsi="Verdana"/>
-                <w:color w:val="1F2A37"/>
-                <w:sz w:val="22"/>
-                <w:szCs w:val="22"/>
-                <w:shd w:fill="FFE873" w:color="auto" w:val="clear"/>
-              </w:rPr>
-              <w:t xml:space="preserve">[DA INTEGRARE: dato 2]</w:t>
+                <w:b w:val="false"/>
+                <w:bCs w:val="false"/>
+                <w:color w:val="1F2A37"/>
+                <w:sz w:val="19"/>
+                <w:szCs w:val="19"/>
+              </w:rPr>
+              <w:t xml:space="preserve">13</w:t>
             </w:r>
           </w:p>
         </w:tc>
@@ -5148,7 +5485,7 @@
                 <w:sz w:val="19"/>
                 <w:szCs w:val="19"/>
               </w:rPr>
-              <w:t xml:space="preserve">…</w:t>
+              <w:t xml:space="preserve">6</w:t>
             </w:r>
           </w:p>
         </w:tc>
@@ -5172,7 +5509,7 @@
                 <w:sz w:val="19"/>
                 <w:szCs w:val="19"/>
               </w:rPr>
-              <w:t xml:space="preserve">…</w:t>
+              <w:t xml:space="preserve">68,4%</w:t>
             </w:r>
           </w:p>
         </w:tc>
@@ -5243,12 +5580,13 @@
             <w:r>
               <w:rPr>
                 <w:rFonts w:ascii="Verdana" w:cs="Verdana" w:eastAsia="Verdana" w:hAnsi="Verdana"/>
-                <w:color w:val="1F2A37"/>
-                <w:sz w:val="22"/>
-                <w:szCs w:val="22"/>
-                <w:shd w:fill="FFE873" w:color="auto" w:val="clear"/>
-              </w:rPr>
-              <w:t xml:space="preserve">[DA INTEGRARE: dato 2]</w:t>
+                <w:b w:val="false"/>
+                <w:bCs w:val="false"/>
+                <w:color w:val="1F2A37"/>
+                <w:sz w:val="19"/>
+                <w:szCs w:val="19"/>
+              </w:rPr>
+              <w:t xml:space="preserve">15</w:t>
             </w:r>
           </w:p>
         </w:tc>
@@ -5272,7 +5610,7 @@
                 <w:sz w:val="19"/>
                 <w:szCs w:val="19"/>
               </w:rPr>
-              <w:t xml:space="preserve">…</w:t>
+              <w:t xml:space="preserve">13</w:t>
             </w:r>
           </w:p>
         </w:tc>
@@ -5296,7 +5634,7 @@
                 <w:sz w:val="19"/>
                 <w:szCs w:val="19"/>
               </w:rPr>
-              <w:t xml:space="preserve">…</w:t>
+              <w:t xml:space="preserve">53,6%</w:t>
             </w:r>
           </w:p>
         </w:tc>
@@ -5349,7 +5687,7 @@
                 <w:sz w:val="19"/>
                 <w:szCs w:val="19"/>
               </w:rPr>
-              <w:t xml:space="preserve">28</w:t>
+              <w:t xml:space="preserve">29</w:t>
             </w:r>
           </w:p>
         </w:tc>
@@ -5367,12 +5705,13 @@
             <w:r>
               <w:rPr>
                 <w:rFonts w:ascii="Verdana" w:cs="Verdana" w:eastAsia="Verdana" w:hAnsi="Verdana"/>
-                <w:color w:val="1F2A37"/>
-                <w:sz w:val="22"/>
-                <w:szCs w:val="22"/>
-                <w:shd w:fill="FFE873" w:color="auto" w:val="clear"/>
-              </w:rPr>
-              <w:t xml:space="preserve">[DA INTEGRARE: dato 2]</w:t>
+                <w:b w:val="false"/>
+                <w:bCs w:val="false"/>
+                <w:color w:val="1F2A37"/>
+                <w:sz w:val="19"/>
+                <w:szCs w:val="19"/>
+              </w:rPr>
+              <w:t xml:space="preserve">14</w:t>
             </w:r>
           </w:p>
         </w:tc>
@@ -5396,7 +5735,7 @@
                 <w:sz w:val="19"/>
                 <w:szCs w:val="19"/>
               </w:rPr>
-              <w:t xml:space="preserve">…</w:t>
+              <w:t xml:space="preserve">15</w:t>
             </w:r>
           </w:p>
         </w:tc>
@@ -5420,7 +5759,7 @@
                 <w:sz w:val="19"/>
                 <w:szCs w:val="19"/>
               </w:rPr>
-              <w:t xml:space="preserve">…</w:t>
+              <w:t xml:space="preserve">48,3%</w:t>
             </w:r>
           </w:p>
         </w:tc>
@@ -5687,7 +6026,7 @@
           <w:sz w:val="22"/>
           <w:szCs w:val="22"/>
         </w:rPr>
-        <w:t xml:space="preserve">Sei praticanti su dieci sono donne. È la base della professione di domani: il punto è che restino e crescano.</w:t>
+        <w:t xml:space="preserve">Negli ultimi due anni sei praticanti su dieci sono donne; nel 2023 erano meno della metà. È la base della professione di domani: il punto è che restino e crescano.</w:t>
       </w:r>
     </w:p>
     <w:p>
@@ -5721,9 +6060,10 @@
         </w:tblBorders>
       </w:tblPr>
       <w:tblGrid>
-        <w:gridCol w:w="4000"/>
-        <w:gridCol w:w="2500"/>
-        <w:gridCol w:w="2526"/>
+        <w:gridCol w:w="1300"/>
+        <w:gridCol w:w="2200"/>
+        <w:gridCol w:w="2400"/>
+        <w:gridCol w:w="3126"/>
       </w:tblGrid>
       <w:tr>
         <w:trPr>
@@ -5731,7 +6071,7 @@
         </w:trPr>
         <w:tc>
           <w:tcPr>
-            <w:tcW w:type="dxa" w:w="4000"/>
+            <w:tcW w:type="dxa" w:w="1300"/>
             <w:shd w:fill="DCE7F2" w:color="auto" w:val="clear"/>
             <w:tcMar>
               <w:top w:type="dxa" w:w="70"/>
@@ -5750,13 +6090,13 @@
                 <w:sz w:val="19"/>
                 <w:szCs w:val="19"/>
               </w:rPr>
-              <w:t xml:space="preserve">2024 → 2025</w:t>
-            </w:r>
-          </w:p>
-        </w:tc>
-        <w:tc>
-          <w:tcPr>
-            <w:tcW w:type="dxa" w:w="2500"/>
+              <w:t xml:space="preserve">Anno</w:t>
+            </w:r>
+          </w:p>
+        </w:tc>
+        <w:tc>
+          <w:tcPr>
+            <w:tcW w:type="dxa" w:w="2200"/>
             <w:shd w:fill="DCE7F2" w:color="auto" w:val="clear"/>
             <w:tcMar>
               <w:top w:type="dxa" w:w="70"/>
@@ -5775,13 +6115,13 @@
                 <w:sz w:val="19"/>
                 <w:szCs w:val="19"/>
               </w:rPr>
-              <w:t xml:space="preserve">Donne</w:t>
-            </w:r>
-          </w:p>
-        </w:tc>
-        <w:tc>
-          <w:tcPr>
-            <w:tcW w:type="dxa" w:w="2526"/>
+              <w:t xml:space="preserve">Iscrizioni donne / uomini</w:t>
+            </w:r>
+          </w:p>
+        </w:tc>
+        <w:tc>
+          <w:tcPr>
+            <w:tcW w:type="dxa" w:w="2400"/>
             <w:shd w:fill="DCE7F2" w:color="auto" w:val="clear"/>
             <w:tcMar>
               <w:top w:type="dxa" w:w="70"/>
@@ -5800,7 +6140,32 @@
                 <w:sz w:val="19"/>
                 <w:szCs w:val="19"/>
               </w:rPr>
-              <w:t xml:space="preserve">Uomini</w:t>
+              <w:t xml:space="preserve">Cancellazioni donne / uomini</w:t>
+            </w:r>
+          </w:p>
+        </w:tc>
+        <w:tc>
+          <w:tcPr>
+            <w:tcW w:type="dxa" w:w="3126"/>
+            <w:shd w:fill="DCE7F2" w:color="auto" w:val="clear"/>
+            <w:tcMar>
+              <w:top w:type="dxa" w:w="70"/>
+              <w:left w:type="dxa" w:w="110"/>
+              <w:bottom w:type="dxa" w:w="70"/>
+              <w:right w:type="dxa" w:w="110"/>
+            </w:tcMar>
+          </w:tcPr>
+          <w:p>
+            <w:r>
+              <w:rPr>
+                <w:rFonts w:ascii="Verdana" w:cs="Verdana" w:eastAsia="Verdana" w:hAnsi="Verdana"/>
+                <w:b/>
+                <w:bCs/>
+                <w:color w:val="1F2A37"/>
+                <w:sz w:val="19"/>
+                <w:szCs w:val="19"/>
+              </w:rPr>
+              <w:t xml:space="preserve">Motivi delle cancellazioni</w:t>
             </w:r>
           </w:p>
         </w:tc>
@@ -5811,73 +6176,97 @@
         </w:trPr>
         <w:tc>
           <w:tcPr>
-            <w:tcW w:type="dxa" w:w="4000"/>
-            <w:tcMar>
-              <w:top w:type="dxa" w:w="70"/>
-              <w:left w:type="dxa" w:w="110"/>
-              <w:bottom w:type="dxa" w:w="70"/>
-              <w:right w:type="dxa" w:w="110"/>
-            </w:tcMar>
-          </w:tcPr>
-          <w:p>
-            <w:r>
-              <w:rPr>
-                <w:rFonts w:ascii="Verdana" w:cs="Verdana" w:eastAsia="Verdana" w:hAnsi="Verdana"/>
-                <w:b w:val="false"/>
-                <w:bCs w:val="false"/>
-                <w:color w:val="1F2A37"/>
-                <w:sz w:val="19"/>
-                <w:szCs w:val="19"/>
-              </w:rPr>
-              <w:t xml:space="preserve">Nuovi ingressi nell’Albo</w:t>
-            </w:r>
-          </w:p>
-        </w:tc>
-        <w:tc>
-          <w:tcPr>
-            <w:tcW w:type="dxa" w:w="2500"/>
-            <w:tcMar>
-              <w:top w:type="dxa" w:w="70"/>
-              <w:left w:type="dxa" w:w="110"/>
-              <w:bottom w:type="dxa" w:w="70"/>
-              <w:right w:type="dxa" w:w="110"/>
-            </w:tcMar>
-          </w:tcPr>
-          <w:p>
-            <w:r>
-              <w:rPr>
-                <w:rFonts w:ascii="Verdana" w:cs="Verdana" w:eastAsia="Verdana" w:hAnsi="Verdana"/>
-                <w:b w:val="false"/>
-                <w:bCs w:val="false"/>
-                <w:color w:val="1F2A37"/>
-                <w:sz w:val="19"/>
-                <w:szCs w:val="19"/>
-              </w:rPr>
-              <w:t xml:space="preserve">2</w:t>
-            </w:r>
-          </w:p>
-        </w:tc>
-        <w:tc>
-          <w:tcPr>
-            <w:tcW w:type="dxa" w:w="2526"/>
-            <w:tcMar>
-              <w:top w:type="dxa" w:w="70"/>
-              <w:left w:type="dxa" w:w="110"/>
-              <w:bottom w:type="dxa" w:w="70"/>
-              <w:right w:type="dxa" w:w="110"/>
-            </w:tcMar>
-          </w:tcPr>
-          <w:p>
-            <w:r>
-              <w:rPr>
-                <w:rFonts w:ascii="Verdana" w:cs="Verdana" w:eastAsia="Verdana" w:hAnsi="Verdana"/>
-                <w:b w:val="false"/>
-                <w:bCs w:val="false"/>
-                <w:color w:val="1F2A37"/>
-                <w:sz w:val="19"/>
-                <w:szCs w:val="19"/>
-              </w:rPr>
-              <w:t xml:space="preserve">7</w:t>
+            <w:tcW w:type="dxa" w:w="1300"/>
+            <w:tcMar>
+              <w:top w:type="dxa" w:w="70"/>
+              <w:left w:type="dxa" w:w="110"/>
+              <w:bottom w:type="dxa" w:w="70"/>
+              <w:right w:type="dxa" w:w="110"/>
+            </w:tcMar>
+          </w:tcPr>
+          <w:p>
+            <w:r>
+              <w:rPr>
+                <w:rFonts w:ascii="Verdana" w:cs="Verdana" w:eastAsia="Verdana" w:hAnsi="Verdana"/>
+                <w:b w:val="false"/>
+                <w:bCs w:val="false"/>
+                <w:color w:val="1F2A37"/>
+                <w:sz w:val="19"/>
+                <w:szCs w:val="19"/>
+              </w:rPr>
+              <w:t xml:space="preserve">2021</w:t>
+            </w:r>
+          </w:p>
+        </w:tc>
+        <w:tc>
+          <w:tcPr>
+            <w:tcW w:type="dxa" w:w="2200"/>
+            <w:tcMar>
+              <w:top w:type="dxa" w:w="70"/>
+              <w:left w:type="dxa" w:w="110"/>
+              <w:bottom w:type="dxa" w:w="70"/>
+              <w:right w:type="dxa" w:w="110"/>
+            </w:tcMar>
+          </w:tcPr>
+          <w:p>
+            <w:r>
+              <w:rPr>
+                <w:rFonts w:ascii="Verdana" w:cs="Verdana" w:eastAsia="Verdana" w:hAnsi="Verdana"/>
+                <w:b w:val="false"/>
+                <w:bCs w:val="false"/>
+                <w:color w:val="1F2A37"/>
+                <w:sz w:val="19"/>
+                <w:szCs w:val="19"/>
+              </w:rPr>
+              <w:t xml:space="preserve">6 / 7</w:t>
+            </w:r>
+          </w:p>
+        </w:tc>
+        <w:tc>
+          <w:tcPr>
+            <w:tcW w:type="dxa" w:w="2400"/>
+            <w:tcMar>
+              <w:top w:type="dxa" w:w="70"/>
+              <w:left w:type="dxa" w:w="110"/>
+              <w:bottom w:type="dxa" w:w="70"/>
+              <w:right w:type="dxa" w:w="110"/>
+            </w:tcMar>
+          </w:tcPr>
+          <w:p>
+            <w:r>
+              <w:rPr>
+                <w:rFonts w:ascii="Verdana" w:cs="Verdana" w:eastAsia="Verdana" w:hAnsi="Verdana"/>
+                <w:b w:val="false"/>
+                <w:bCs w:val="false"/>
+                <w:color w:val="1F2A37"/>
+                <w:sz w:val="19"/>
+                <w:szCs w:val="19"/>
+              </w:rPr>
+              <w:t xml:space="preserve">6 / 6</w:t>
+            </w:r>
+          </w:p>
+        </w:tc>
+        <w:tc>
+          <w:tcPr>
+            <w:tcW w:type="dxa" w:w="3126"/>
+            <w:tcMar>
+              <w:top w:type="dxa" w:w="70"/>
+              <w:left w:type="dxa" w:w="110"/>
+              <w:bottom w:type="dxa" w:w="70"/>
+              <w:right w:type="dxa" w:w="110"/>
+            </w:tcMar>
+          </w:tcPr>
+          <w:p>
+            <w:r>
+              <w:rPr>
+                <w:rFonts w:ascii="Verdana" w:cs="Verdana" w:eastAsia="Verdana" w:hAnsi="Verdana"/>
+                <w:b w:val="false"/>
+                <w:bCs w:val="false"/>
+                <w:color w:val="1F2A37"/>
+                <w:sz w:val="19"/>
+                <w:szCs w:val="19"/>
+              </w:rPr>
+              <w:t xml:space="preserve">su richiesta 11, trasferimento 1</w:t>
             </w:r>
           </w:p>
         </w:tc>
@@ -5888,73 +6277,501 @@
         </w:trPr>
         <w:tc>
           <w:tcPr>
-            <w:tcW w:type="dxa" w:w="4000"/>
-            <w:tcMar>
-              <w:top w:type="dxa" w:w="70"/>
-              <w:left w:type="dxa" w:w="110"/>
-              <w:bottom w:type="dxa" w:w="70"/>
-              <w:right w:type="dxa" w:w="110"/>
-            </w:tcMar>
-          </w:tcPr>
-          <w:p>
-            <w:r>
-              <w:rPr>
-                <w:rFonts w:ascii="Verdana" w:cs="Verdana" w:eastAsia="Verdana" w:hAnsi="Verdana"/>
-                <w:b w:val="false"/>
-                <w:bCs w:val="false"/>
-                <w:color w:val="1F2A37"/>
-                <w:sz w:val="19"/>
-                <w:szCs w:val="19"/>
-              </w:rPr>
-              <w:t xml:space="preserve">Uscite dall’Albo</w:t>
-            </w:r>
-          </w:p>
-        </w:tc>
-        <w:tc>
-          <w:tcPr>
-            <w:tcW w:type="dxa" w:w="2500"/>
-            <w:tcMar>
-              <w:top w:type="dxa" w:w="70"/>
-              <w:left w:type="dxa" w:w="110"/>
-              <w:bottom w:type="dxa" w:w="70"/>
-              <w:right w:type="dxa" w:w="110"/>
-            </w:tcMar>
-          </w:tcPr>
-          <w:p>
-            <w:r>
-              <w:rPr>
-                <w:rFonts w:ascii="Verdana" w:cs="Verdana" w:eastAsia="Verdana" w:hAnsi="Verdana"/>
-                <w:b w:val="false"/>
-                <w:bCs w:val="false"/>
-                <w:color w:val="1F2A37"/>
-                <w:sz w:val="19"/>
-                <w:szCs w:val="19"/>
-              </w:rPr>
-              <w:t xml:space="preserve">9</w:t>
-            </w:r>
-          </w:p>
-        </w:tc>
-        <w:tc>
-          <w:tcPr>
-            <w:tcW w:type="dxa" w:w="2526"/>
-            <w:tcMar>
-              <w:top w:type="dxa" w:w="70"/>
-              <w:left w:type="dxa" w:w="110"/>
-              <w:bottom w:type="dxa" w:w="70"/>
-              <w:right w:type="dxa" w:w="110"/>
-            </w:tcMar>
-          </w:tcPr>
-          <w:p>
-            <w:r>
-              <w:rPr>
-                <w:rFonts w:ascii="Verdana" w:cs="Verdana" w:eastAsia="Verdana" w:hAnsi="Verdana"/>
-                <w:b w:val="false"/>
-                <w:bCs w:val="false"/>
-                <w:color w:val="1F2A37"/>
-                <w:sz w:val="19"/>
-                <w:szCs w:val="19"/>
-              </w:rPr>
-              <w:t xml:space="preserve">8</w:t>
+            <w:tcW w:type="dxa" w:w="1300"/>
+            <w:tcMar>
+              <w:top w:type="dxa" w:w="70"/>
+              <w:left w:type="dxa" w:w="110"/>
+              <w:bottom w:type="dxa" w:w="70"/>
+              <w:right w:type="dxa" w:w="110"/>
+            </w:tcMar>
+          </w:tcPr>
+          <w:p>
+            <w:r>
+              <w:rPr>
+                <w:rFonts w:ascii="Verdana" w:cs="Verdana" w:eastAsia="Verdana" w:hAnsi="Verdana"/>
+                <w:b w:val="false"/>
+                <w:bCs w:val="false"/>
+                <w:color w:val="1F2A37"/>
+                <w:sz w:val="19"/>
+                <w:szCs w:val="19"/>
+              </w:rPr>
+              <w:t xml:space="preserve">2022</w:t>
+            </w:r>
+          </w:p>
+        </w:tc>
+        <w:tc>
+          <w:tcPr>
+            <w:tcW w:type="dxa" w:w="2200"/>
+            <w:tcMar>
+              <w:top w:type="dxa" w:w="70"/>
+              <w:left w:type="dxa" w:w="110"/>
+              <w:bottom w:type="dxa" w:w="70"/>
+              <w:right w:type="dxa" w:w="110"/>
+            </w:tcMar>
+          </w:tcPr>
+          <w:p>
+            <w:r>
+              <w:rPr>
+                <w:rFonts w:ascii="Verdana" w:cs="Verdana" w:eastAsia="Verdana" w:hAnsi="Verdana"/>
+                <w:b w:val="false"/>
+                <w:bCs w:val="false"/>
+                <w:color w:val="1F2A37"/>
+                <w:sz w:val="19"/>
+                <w:szCs w:val="19"/>
+              </w:rPr>
+              <w:t xml:space="preserve">6 / 2</w:t>
+            </w:r>
+          </w:p>
+        </w:tc>
+        <w:tc>
+          <w:tcPr>
+            <w:tcW w:type="dxa" w:w="2400"/>
+            <w:tcMar>
+              <w:top w:type="dxa" w:w="70"/>
+              <w:left w:type="dxa" w:w="110"/>
+              <w:bottom w:type="dxa" w:w="70"/>
+              <w:right w:type="dxa" w:w="110"/>
+            </w:tcMar>
+          </w:tcPr>
+          <w:p>
+            <w:r>
+              <w:rPr>
+                <w:rFonts w:ascii="Verdana" w:cs="Verdana" w:eastAsia="Verdana" w:hAnsi="Verdana"/>
+                <w:b w:val="false"/>
+                <w:bCs w:val="false"/>
+                <w:color w:val="1F2A37"/>
+                <w:sz w:val="19"/>
+                <w:szCs w:val="19"/>
+              </w:rPr>
+              <w:t xml:space="preserve">2 / 7</w:t>
+            </w:r>
+          </w:p>
+        </w:tc>
+        <w:tc>
+          <w:tcPr>
+            <w:tcW w:type="dxa" w:w="3126"/>
+            <w:tcMar>
+              <w:top w:type="dxa" w:w="70"/>
+              <w:left w:type="dxa" w:w="110"/>
+              <w:bottom w:type="dxa" w:w="70"/>
+              <w:right w:type="dxa" w:w="110"/>
+            </w:tcMar>
+          </w:tcPr>
+          <w:p>
+            <w:r>
+              <w:rPr>
+                <w:rFonts w:ascii="Verdana" w:cs="Verdana" w:eastAsia="Verdana" w:hAnsi="Verdana"/>
+                <w:b w:val="false"/>
+                <w:bCs w:val="false"/>
+                <w:color w:val="1F2A37"/>
+                <w:sz w:val="19"/>
+                <w:szCs w:val="19"/>
+              </w:rPr>
+              <w:t xml:space="preserve">su richiesta 7, decesso 1, trasferimento 1</w:t>
+            </w:r>
+          </w:p>
+        </w:tc>
+      </w:tr>
+      <w:tr>
+        <w:trPr>
+          <w:cantSplit/>
+        </w:trPr>
+        <w:tc>
+          <w:tcPr>
+            <w:tcW w:type="dxa" w:w="1300"/>
+            <w:tcMar>
+              <w:top w:type="dxa" w:w="70"/>
+              <w:left w:type="dxa" w:w="110"/>
+              <w:bottom w:type="dxa" w:w="70"/>
+              <w:right w:type="dxa" w:w="110"/>
+            </w:tcMar>
+          </w:tcPr>
+          <w:p>
+            <w:r>
+              <w:rPr>
+                <w:rFonts w:ascii="Verdana" w:cs="Verdana" w:eastAsia="Verdana" w:hAnsi="Verdana"/>
+                <w:b w:val="false"/>
+                <w:bCs w:val="false"/>
+                <w:color w:val="1F2A37"/>
+                <w:sz w:val="19"/>
+                <w:szCs w:val="19"/>
+              </w:rPr>
+              <w:t xml:space="preserve">2023</w:t>
+            </w:r>
+          </w:p>
+        </w:tc>
+        <w:tc>
+          <w:tcPr>
+            <w:tcW w:type="dxa" w:w="2200"/>
+            <w:tcMar>
+              <w:top w:type="dxa" w:w="70"/>
+              <w:left w:type="dxa" w:w="110"/>
+              <w:bottom w:type="dxa" w:w="70"/>
+              <w:right w:type="dxa" w:w="110"/>
+            </w:tcMar>
+          </w:tcPr>
+          <w:p>
+            <w:r>
+              <w:rPr>
+                <w:rFonts w:ascii="Verdana" w:cs="Verdana" w:eastAsia="Verdana" w:hAnsi="Verdana"/>
+                <w:b w:val="false"/>
+                <w:bCs w:val="false"/>
+                <w:color w:val="1F2A37"/>
+                <w:sz w:val="19"/>
+                <w:szCs w:val="19"/>
+              </w:rPr>
+              <w:t xml:space="preserve">9 / 5</w:t>
+            </w:r>
+          </w:p>
+        </w:tc>
+        <w:tc>
+          <w:tcPr>
+            <w:tcW w:type="dxa" w:w="2400"/>
+            <w:tcMar>
+              <w:top w:type="dxa" w:w="70"/>
+              <w:left w:type="dxa" w:w="110"/>
+              <w:bottom w:type="dxa" w:w="70"/>
+              <w:right w:type="dxa" w:w="110"/>
+            </w:tcMar>
+          </w:tcPr>
+          <w:p>
+            <w:r>
+              <w:rPr>
+                <w:rFonts w:ascii="Verdana" w:cs="Verdana" w:eastAsia="Verdana" w:hAnsi="Verdana"/>
+                <w:b w:val="false"/>
+                <w:bCs w:val="false"/>
+                <w:color w:val="1F2A37"/>
+                <w:sz w:val="19"/>
+                <w:szCs w:val="19"/>
+              </w:rPr>
+              <w:t xml:space="preserve">4 / 6</w:t>
+            </w:r>
+          </w:p>
+        </w:tc>
+        <w:tc>
+          <w:tcPr>
+            <w:tcW w:type="dxa" w:w="3126"/>
+            <w:tcMar>
+              <w:top w:type="dxa" w:w="70"/>
+              <w:left w:type="dxa" w:w="110"/>
+              <w:bottom w:type="dxa" w:w="70"/>
+              <w:right w:type="dxa" w:w="110"/>
+            </w:tcMar>
+          </w:tcPr>
+          <w:p>
+            <w:r>
+              <w:rPr>
+                <w:rFonts w:ascii="Verdana" w:cs="Verdana" w:eastAsia="Verdana" w:hAnsi="Verdana"/>
+                <w:b w:val="false"/>
+                <w:bCs w:val="false"/>
+                <w:color w:val="1F2A37"/>
+                <w:sz w:val="19"/>
+                <w:szCs w:val="19"/>
+              </w:rPr>
+              <w:t xml:space="preserve">decesso 1, trasferimento 1, non indicato 8</w:t>
+            </w:r>
+          </w:p>
+        </w:tc>
+      </w:tr>
+      <w:tr>
+        <w:trPr>
+          <w:cantSplit/>
+        </w:trPr>
+        <w:tc>
+          <w:tcPr>
+            <w:tcW w:type="dxa" w:w="1300"/>
+            <w:tcMar>
+              <w:top w:type="dxa" w:w="70"/>
+              <w:left w:type="dxa" w:w="110"/>
+              <w:bottom w:type="dxa" w:w="70"/>
+              <w:right w:type="dxa" w:w="110"/>
+            </w:tcMar>
+          </w:tcPr>
+          <w:p>
+            <w:r>
+              <w:rPr>
+                <w:rFonts w:ascii="Verdana" w:cs="Verdana" w:eastAsia="Verdana" w:hAnsi="Verdana"/>
+                <w:b w:val="false"/>
+                <w:bCs w:val="false"/>
+                <w:color w:val="1F2A37"/>
+                <w:sz w:val="19"/>
+                <w:szCs w:val="19"/>
+              </w:rPr>
+              <w:t xml:space="preserve">2024</w:t>
+            </w:r>
+          </w:p>
+        </w:tc>
+        <w:tc>
+          <w:tcPr>
+            <w:tcW w:type="dxa" w:w="2200"/>
+            <w:tcMar>
+              <w:top w:type="dxa" w:w="70"/>
+              <w:left w:type="dxa" w:w="110"/>
+              <w:bottom w:type="dxa" w:w="70"/>
+              <w:right w:type="dxa" w:w="110"/>
+            </w:tcMar>
+          </w:tcPr>
+          <w:p>
+            <w:r>
+              <w:rPr>
+                <w:rFonts w:ascii="Verdana" w:cs="Verdana" w:eastAsia="Verdana" w:hAnsi="Verdana"/>
+                <w:b w:val="false"/>
+                <w:bCs w:val="false"/>
+                <w:color w:val="1F2A37"/>
+                <w:sz w:val="19"/>
+                <w:szCs w:val="19"/>
+              </w:rPr>
+              <w:t xml:space="preserve">6 / 1</w:t>
+            </w:r>
+          </w:p>
+        </w:tc>
+        <w:tc>
+          <w:tcPr>
+            <w:tcW w:type="dxa" w:w="2400"/>
+            <w:tcMar>
+              <w:top w:type="dxa" w:w="70"/>
+              <w:left w:type="dxa" w:w="110"/>
+              <w:bottom w:type="dxa" w:w="70"/>
+              <w:right w:type="dxa" w:w="110"/>
+            </w:tcMar>
+          </w:tcPr>
+          <w:p>
+            <w:r>
+              <w:rPr>
+                <w:rFonts w:ascii="Verdana" w:cs="Verdana" w:eastAsia="Verdana" w:hAnsi="Verdana"/>
+                <w:b w:val="false"/>
+                <w:bCs w:val="false"/>
+                <w:color w:val="1F2A37"/>
+                <w:sz w:val="19"/>
+                <w:szCs w:val="19"/>
+              </w:rPr>
+              <w:t xml:space="preserve">8 / 6</w:t>
+            </w:r>
+          </w:p>
+        </w:tc>
+        <w:tc>
+          <w:tcPr>
+            <w:tcW w:type="dxa" w:w="3126"/>
+            <w:tcMar>
+              <w:top w:type="dxa" w:w="70"/>
+              <w:left w:type="dxa" w:w="110"/>
+              <w:bottom w:type="dxa" w:w="70"/>
+              <w:right w:type="dxa" w:w="110"/>
+            </w:tcMar>
+          </w:tcPr>
+          <w:p>
+            <w:r>
+              <w:rPr>
+                <w:rFonts w:ascii="Verdana" w:cs="Verdana" w:eastAsia="Verdana" w:hAnsi="Verdana"/>
+                <w:b w:val="false"/>
+                <w:bCs w:val="false"/>
+                <w:color w:val="1F2A37"/>
+                <w:sz w:val="19"/>
+                <w:szCs w:val="19"/>
+              </w:rPr>
+              <w:t xml:space="preserve">su richiesta 12, decesso 1, trasferimento 1</w:t>
+            </w:r>
+          </w:p>
+        </w:tc>
+      </w:tr>
+      <w:tr>
+        <w:trPr>
+          <w:cantSplit/>
+        </w:trPr>
+        <w:tc>
+          <w:tcPr>
+            <w:tcW w:type="dxa" w:w="1300"/>
+            <w:tcMar>
+              <w:top w:type="dxa" w:w="70"/>
+              <w:left w:type="dxa" w:w="110"/>
+              <w:bottom w:type="dxa" w:w="70"/>
+              <w:right w:type="dxa" w:w="110"/>
+            </w:tcMar>
+          </w:tcPr>
+          <w:p>
+            <w:r>
+              <w:rPr>
+                <w:rFonts w:ascii="Verdana" w:cs="Verdana" w:eastAsia="Verdana" w:hAnsi="Verdana"/>
+                <w:b w:val="false"/>
+                <w:bCs w:val="false"/>
+                <w:color w:val="1F2A37"/>
+                <w:sz w:val="19"/>
+                <w:szCs w:val="19"/>
+              </w:rPr>
+              <w:t xml:space="preserve">2025</w:t>
+            </w:r>
+          </w:p>
+        </w:tc>
+        <w:tc>
+          <w:tcPr>
+            <w:tcW w:type="dxa" w:w="2200"/>
+            <w:tcMar>
+              <w:top w:type="dxa" w:w="70"/>
+              <w:left w:type="dxa" w:w="110"/>
+              <w:bottom w:type="dxa" w:w="70"/>
+              <w:right w:type="dxa" w:w="110"/>
+            </w:tcMar>
+          </w:tcPr>
+          <w:p>
+            <w:r>
+              <w:rPr>
+                <w:rFonts w:ascii="Verdana" w:cs="Verdana" w:eastAsia="Verdana" w:hAnsi="Verdana"/>
+                <w:b w:val="false"/>
+                <w:bCs w:val="false"/>
+                <w:color w:val="1F2A37"/>
+                <w:sz w:val="19"/>
+                <w:szCs w:val="19"/>
+              </w:rPr>
+              <w:t xml:space="preserve">2 / 8</w:t>
+            </w:r>
+          </w:p>
+        </w:tc>
+        <w:tc>
+          <w:tcPr>
+            <w:tcW w:type="dxa" w:w="2400"/>
+            <w:tcMar>
+              <w:top w:type="dxa" w:w="70"/>
+              <w:left w:type="dxa" w:w="110"/>
+              <w:bottom w:type="dxa" w:w="70"/>
+              <w:right w:type="dxa" w:w="110"/>
+            </w:tcMar>
+          </w:tcPr>
+          <w:p>
+            <w:r>
+              <w:rPr>
+                <w:rFonts w:ascii="Verdana" w:cs="Verdana" w:eastAsia="Verdana" w:hAnsi="Verdana"/>
+                <w:b w:val="false"/>
+                <w:bCs w:val="false"/>
+                <w:color w:val="1F2A37"/>
+                <w:sz w:val="19"/>
+                <w:szCs w:val="19"/>
+              </w:rPr>
+              <w:t xml:space="preserve">9 / 9</w:t>
+            </w:r>
+          </w:p>
+        </w:tc>
+        <w:tc>
+          <w:tcPr>
+            <w:tcW w:type="dxa" w:w="3126"/>
+            <w:tcMar>
+              <w:top w:type="dxa" w:w="70"/>
+              <w:left w:type="dxa" w:w="110"/>
+              <w:bottom w:type="dxa" w:w="70"/>
+              <w:right w:type="dxa" w:w="110"/>
+            </w:tcMar>
+          </w:tcPr>
+          <w:p>
+            <w:r>
+              <w:rPr>
+                <w:rFonts w:ascii="Verdana" w:cs="Verdana" w:eastAsia="Verdana" w:hAnsi="Verdana"/>
+                <w:b w:val="false"/>
+                <w:bCs w:val="false"/>
+                <w:color w:val="1F2A37"/>
+                <w:sz w:val="19"/>
+                <w:szCs w:val="19"/>
+              </w:rPr>
+              <w:t xml:space="preserve">su richiesta 12, decesso 3, trasferimento 3</w:t>
+            </w:r>
+          </w:p>
+        </w:tc>
+      </w:tr>
+      <w:tr>
+        <w:trPr>
+          <w:cantSplit/>
+        </w:trPr>
+        <w:tc>
+          <w:tcPr>
+            <w:tcW w:type="dxa" w:w="1300"/>
+            <w:tcMar>
+              <w:top w:type="dxa" w:w="70"/>
+              <w:left w:type="dxa" w:w="110"/>
+              <w:bottom w:type="dxa" w:w="70"/>
+              <w:right w:type="dxa" w:w="110"/>
+            </w:tcMar>
+          </w:tcPr>
+          <w:p>
+            <w:r>
+              <w:rPr>
+                <w:rFonts w:ascii="Verdana" w:cs="Verdana" w:eastAsia="Verdana" w:hAnsi="Verdana"/>
+                <w:b w:val="false"/>
+                <w:bCs w:val="false"/>
+                <w:color w:val="1F2A37"/>
+                <w:sz w:val="19"/>
+                <w:szCs w:val="19"/>
+              </w:rPr>
+              <w:t xml:space="preserve">Totale</w:t>
+            </w:r>
+          </w:p>
+        </w:tc>
+        <w:tc>
+          <w:tcPr>
+            <w:tcW w:type="dxa" w:w="2200"/>
+            <w:tcMar>
+              <w:top w:type="dxa" w:w="70"/>
+              <w:left w:type="dxa" w:w="110"/>
+              <w:bottom w:type="dxa" w:w="70"/>
+              <w:right w:type="dxa" w:w="110"/>
+            </w:tcMar>
+          </w:tcPr>
+          <w:p>
+            <w:r>
+              <w:rPr>
+                <w:rFonts w:ascii="Verdana" w:cs="Verdana" w:eastAsia="Verdana" w:hAnsi="Verdana"/>
+                <w:b w:val="false"/>
+                <w:bCs w:val="false"/>
+                <w:color w:val="1F2A37"/>
+                <w:sz w:val="19"/>
+                <w:szCs w:val="19"/>
+              </w:rPr>
+              <w:t xml:space="preserve">29 / 23</w:t>
+            </w:r>
+          </w:p>
+        </w:tc>
+        <w:tc>
+          <w:tcPr>
+            <w:tcW w:type="dxa" w:w="2400"/>
+            <w:tcMar>
+              <w:top w:type="dxa" w:w="70"/>
+              <w:left w:type="dxa" w:w="110"/>
+              <w:bottom w:type="dxa" w:w="70"/>
+              <w:right w:type="dxa" w:w="110"/>
+            </w:tcMar>
+          </w:tcPr>
+          <w:p>
+            <w:r>
+              <w:rPr>
+                <w:rFonts w:ascii="Verdana" w:cs="Verdana" w:eastAsia="Verdana" w:hAnsi="Verdana"/>
+                <w:b w:val="false"/>
+                <w:bCs w:val="false"/>
+                <w:color w:val="1F2A37"/>
+                <w:sz w:val="19"/>
+                <w:szCs w:val="19"/>
+              </w:rPr>
+              <w:t xml:space="preserve">29 / 34</w:t>
+            </w:r>
+          </w:p>
+        </w:tc>
+        <w:tc>
+          <w:tcPr>
+            <w:tcW w:type="dxa" w:w="3126"/>
+            <w:tcMar>
+              <w:top w:type="dxa" w:w="70"/>
+              <w:left w:type="dxa" w:w="110"/>
+              <w:bottom w:type="dxa" w:w="70"/>
+              <w:right w:type="dxa" w:w="110"/>
+            </w:tcMar>
+          </w:tcPr>
+          <w:p>
+            <w:r>
+              <w:rPr>
+                <w:rFonts w:ascii="Verdana" w:cs="Verdana" w:eastAsia="Verdana" w:hAnsi="Verdana"/>
+                <w:b w:val="false"/>
+                <w:bCs w:val="false"/>
+                <w:color w:val="1F2A37"/>
+                <w:sz w:val="19"/>
+                <w:szCs w:val="19"/>
+              </w:rPr>
+              <w:t xml:space="preserve"/>
             </w:r>
           </w:p>
         </w:tc>
@@ -5971,17 +6788,7 @@
           <w:sz w:val="22"/>
           <w:szCs w:val="22"/>
         </w:rPr>
-        <w:t xml:space="preserve">Stima del CPO dal confronto degli elenchi anonimi 2024 e 2025. </w:t>
-      </w:r>
-      <w:r>
-        <w:rPr>
-          <w:rFonts w:ascii="Verdana" w:cs="Verdana" w:eastAsia="Verdana" w:hAnsi="Verdana"/>
-          <w:color w:val="1F2A37"/>
-          <w:sz w:val="22"/>
-          <w:szCs w:val="22"/>
-          <w:shd w:fill="FFE873" w:color="auto" w:val="clear"/>
-        </w:rPr>
-        <w:t xml:space="preserve">[DA INTEGRARE: dato 1: iscrizioni e cancellazioni 2021-2025 per genere, età e motivo]</w:t>
+        <w:t xml:space="preserve">In cinque anni sono entrate 29 donne e 23 uomini, ma sono uscite 29 donne e 34 uomini. Il 2025 è un’eccezione: entrano 2 donne e 8 uomini, mentre escono 9 donne e 9 uomini. Chi lascia la professione presto è soprattutto donna: tra le cancellazioni sotto i 50 anni le donne sono 8 e gli uomini 3, e solo nel 2025 le donne sono 4. Quasi tutte si cancellano su richiesta.</w:t>
       </w:r>
     </w:p>
     <w:p>
@@ -5995,7 +6802,7 @@
           <w:sz w:val="22"/>
           <w:szCs w:val="22"/>
         </w:rPr>
-        <w:t xml:space="preserve">Due segnali da approfondire. Le praticanti sono il 60%, ma tra i nuovi iscritti del 2025 le donne sono solo 2 su 9. Tra chi è uscito, 4 donne hanno meno di 50 anni, mentre gli uomini usciti sono quasi tutti oltre i 57 anni. Anche a livello nazionale le donne sono passate dal 39% al 46% delle cancellazioni dalla Cassa tra il 2018 e il 2023.</w:t>
+        <w:t xml:space="preserve">Anche a livello nazionale le donne sono passate dal 39% al 46% delle cancellazioni dalla Cassa tra il 2018 e il 2023. Il questionario chiederà a chi pensa di lasciare quali sono i motivi.</w:t>
       </w:r>
     </w:p>
     <w:p>
@@ -6163,7 +6970,7 @@
                 <w:sz w:val="19"/>
                 <w:szCs w:val="19"/>
               </w:rPr>
-              <w:t xml:space="preserve">Consiglio 2022-2025</w:t>
+              <w:t xml:space="preserve">Consiglio 2022-2026</w:t>
             </w:r>
           </w:p>
         </w:tc>
@@ -6282,12 +7089,13 @@
             <w:r>
               <w:rPr>
                 <w:rFonts w:ascii="Verdana" w:cs="Verdana" w:eastAsia="Verdana" w:hAnsi="Verdana"/>
-                <w:color w:val="1F2A37"/>
-                <w:sz w:val="22"/>
-                <w:szCs w:val="22"/>
-                <w:shd w:fill="FFE873" w:color="auto" w:val="clear"/>
-              </w:rPr>
-              <w:t xml:space="preserve">[DA INTEGRARE: dato 3]</w:t>
+                <w:b w:val="false"/>
+                <w:bCs w:val="false"/>
+                <w:color w:val="1F2A37"/>
+                <w:sz w:val="19"/>
+                <w:szCs w:val="19"/>
+              </w:rPr>
+              <w:t xml:space="preserve">5</w:t>
             </w:r>
           </w:p>
         </w:tc>
@@ -6311,7 +7119,7 @@
                 <w:sz w:val="19"/>
                 <w:szCs w:val="19"/>
               </w:rPr>
-              <w:t xml:space="preserve">…</w:t>
+              <w:t xml:space="preserve">6</w:t>
             </w:r>
           </w:p>
         </w:tc>
@@ -6335,7 +7143,7 @@
                 <w:sz w:val="19"/>
                 <w:szCs w:val="19"/>
               </w:rPr>
-              <w:t xml:space="preserve">…</w:t>
+              <w:t xml:space="preserve">45,5%</w:t>
             </w:r>
           </w:p>
         </w:tc>
@@ -6388,7 +7196,7 @@
                 <w:sz w:val="19"/>
                 <w:szCs w:val="19"/>
               </w:rPr>
-              <w:t xml:space="preserve">5</w:t>
+              <w:t xml:space="preserve">6</w:t>
             </w:r>
           </w:p>
         </w:tc>
@@ -6412,7 +7220,7 @@
                 <w:sz w:val="19"/>
                 <w:szCs w:val="19"/>
               </w:rPr>
-              <w:t xml:space="preserve">2</w:t>
+              <w:t xml:space="preserve">1</w:t>
             </w:r>
           </w:p>
         </w:tc>
@@ -6436,7 +7244,7 @@
                 <w:sz w:val="19"/>
                 <w:szCs w:val="19"/>
               </w:rPr>
-              <w:t xml:space="preserve">71,4%</w:t>
+              <w:t xml:space="preserve">85,7%</w:t>
             </w:r>
           </w:p>
         </w:tc>
@@ -6465,7 +7273,7 @@
                 <w:sz w:val="19"/>
                 <w:szCs w:val="19"/>
               </w:rPr>
-              <w:t xml:space="preserve">Consiglio di disciplina, revisori, commissioni</w:t>
+              <w:t xml:space="preserve">Consiglio di disciplina 2022-2026 (Presidente donna)</w:t>
             </w:r>
           </w:p>
         </w:tc>
@@ -6483,12 +7291,13 @@
             <w:r>
               <w:rPr>
                 <w:rFonts w:ascii="Verdana" w:cs="Verdana" w:eastAsia="Verdana" w:hAnsi="Verdana"/>
-                <w:color w:val="1F2A37"/>
-                <w:sz w:val="22"/>
-                <w:szCs w:val="22"/>
-                <w:shd w:fill="FFE873" w:color="auto" w:val="clear"/>
-              </w:rPr>
-              <w:t xml:space="preserve">[DA INTEGRARE: dato 3]</w:t>
+                <w:b w:val="false"/>
+                <w:bCs w:val="false"/>
+                <w:color w:val="1F2A37"/>
+                <w:sz w:val="19"/>
+                <w:szCs w:val="19"/>
+              </w:rPr>
+              <w:t xml:space="preserve">5</w:t>
             </w:r>
           </w:p>
         </w:tc>
@@ -6512,7 +7321,7 @@
                 <w:sz w:val="19"/>
                 <w:szCs w:val="19"/>
               </w:rPr>
-              <w:t xml:space="preserve">…</w:t>
+              <w:t xml:space="preserve">6</w:t>
             </w:r>
           </w:p>
         </w:tc>
@@ -6536,7 +7345,714 @@
                 <w:sz w:val="19"/>
                 <w:szCs w:val="19"/>
               </w:rPr>
-              <w:t xml:space="preserve">…</w:t>
+              <w:t xml:space="preserve">45,5%</w:t>
+            </w:r>
+          </w:p>
+        </w:tc>
+      </w:tr>
+      <w:tr>
+        <w:trPr>
+          <w:cantSplit/>
+        </w:trPr>
+        <w:tc>
+          <w:tcPr>
+            <w:tcW w:type="dxa" w:w="3800"/>
+            <w:tcMar>
+              <w:top w:type="dxa" w:w="70"/>
+              <w:left w:type="dxa" w:w="110"/>
+              <w:bottom w:type="dxa" w:w="70"/>
+              <w:right w:type="dxa" w:w="110"/>
+            </w:tcMar>
+          </w:tcPr>
+          <w:p>
+            <w:r>
+              <w:rPr>
+                <w:rFonts w:ascii="Verdana" w:cs="Verdana" w:eastAsia="Verdana" w:hAnsi="Verdana"/>
+                <w:b w:val="false"/>
+                <w:bCs w:val="false"/>
+                <w:color w:val="1F2A37"/>
+                <w:sz w:val="19"/>
+                <w:szCs w:val="19"/>
+              </w:rPr>
+              <w:t xml:space="preserve">Consiglio di disciplina 2026-2030 (Presidente e Segretaria donne)</w:t>
+            </w:r>
+          </w:p>
+        </w:tc>
+        <w:tc>
+          <w:tcPr>
+            <w:tcW w:type="dxa" w:w="1600"/>
+            <w:tcMar>
+              <w:top w:type="dxa" w:w="70"/>
+              <w:left w:type="dxa" w:w="110"/>
+              <w:bottom w:type="dxa" w:w="70"/>
+              <w:right w:type="dxa" w:w="110"/>
+            </w:tcMar>
+          </w:tcPr>
+          <w:p>
+            <w:r>
+              <w:rPr>
+                <w:rFonts w:ascii="Verdana" w:cs="Verdana" w:eastAsia="Verdana" w:hAnsi="Verdana"/>
+                <w:b w:val="false"/>
+                <w:bCs w:val="false"/>
+                <w:color w:val="1F2A37"/>
+                <w:sz w:val="19"/>
+                <w:szCs w:val="19"/>
+              </w:rPr>
+              <w:t xml:space="preserve">6</w:t>
+            </w:r>
+          </w:p>
+        </w:tc>
+        <w:tc>
+          <w:tcPr>
+            <w:tcW w:type="dxa" w:w="1600"/>
+            <w:tcMar>
+              <w:top w:type="dxa" w:w="70"/>
+              <w:left w:type="dxa" w:w="110"/>
+              <w:bottom w:type="dxa" w:w="70"/>
+              <w:right w:type="dxa" w:w="110"/>
+            </w:tcMar>
+          </w:tcPr>
+          <w:p>
+            <w:r>
+              <w:rPr>
+                <w:rFonts w:ascii="Verdana" w:cs="Verdana" w:eastAsia="Verdana" w:hAnsi="Verdana"/>
+                <w:b w:val="false"/>
+                <w:bCs w:val="false"/>
+                <w:color w:val="1F2A37"/>
+                <w:sz w:val="19"/>
+                <w:szCs w:val="19"/>
+              </w:rPr>
+              <w:t xml:space="preserve">5</w:t>
+            </w:r>
+          </w:p>
+        </w:tc>
+        <w:tc>
+          <w:tcPr>
+            <w:tcW w:type="dxa" w:w="2026"/>
+            <w:tcMar>
+              <w:top w:type="dxa" w:w="70"/>
+              <w:left w:type="dxa" w:w="110"/>
+              <w:bottom w:type="dxa" w:w="70"/>
+              <w:right w:type="dxa" w:w="110"/>
+            </w:tcMar>
+          </w:tcPr>
+          <w:p>
+            <w:r>
+              <w:rPr>
+                <w:rFonts w:ascii="Verdana" w:cs="Verdana" w:eastAsia="Verdana" w:hAnsi="Verdana"/>
+                <w:b w:val="false"/>
+                <w:bCs w:val="false"/>
+                <w:color w:val="1F2A37"/>
+                <w:sz w:val="19"/>
+                <w:szCs w:val="19"/>
+              </w:rPr>
+              <w:t xml:space="preserve">54,5%</w:t>
+            </w:r>
+          </w:p>
+        </w:tc>
+      </w:tr>
+      <w:tr>
+        <w:trPr>
+          <w:cantSplit/>
+        </w:trPr>
+        <w:tc>
+          <w:tcPr>
+            <w:tcW w:type="dxa" w:w="3800"/>
+            <w:tcMar>
+              <w:top w:type="dxa" w:w="70"/>
+              <w:left w:type="dxa" w:w="110"/>
+              <w:bottom w:type="dxa" w:w="70"/>
+              <w:right w:type="dxa" w:w="110"/>
+            </w:tcMar>
+          </w:tcPr>
+          <w:p>
+            <w:r>
+              <w:rPr>
+                <w:rFonts w:ascii="Verdana" w:cs="Verdana" w:eastAsia="Verdana" w:hAnsi="Verdana"/>
+                <w:b w:val="false"/>
+                <w:bCs w:val="false"/>
+                <w:color w:val="1F2A37"/>
+                <w:sz w:val="19"/>
+                <w:szCs w:val="19"/>
+              </w:rPr>
+              <w:t xml:space="preserve">Collegio dei revisori 2022-2026 (Presidente donna)</w:t>
+            </w:r>
+          </w:p>
+        </w:tc>
+        <w:tc>
+          <w:tcPr>
+            <w:tcW w:type="dxa" w:w="1600"/>
+            <w:tcMar>
+              <w:top w:type="dxa" w:w="70"/>
+              <w:left w:type="dxa" w:w="110"/>
+              <w:bottom w:type="dxa" w:w="70"/>
+              <w:right w:type="dxa" w:w="110"/>
+            </w:tcMar>
+          </w:tcPr>
+          <w:p>
+            <w:r>
+              <w:rPr>
+                <w:rFonts w:ascii="Verdana" w:cs="Verdana" w:eastAsia="Verdana" w:hAnsi="Verdana"/>
+                <w:b w:val="false"/>
+                <w:bCs w:val="false"/>
+                <w:color w:val="1F2A37"/>
+                <w:sz w:val="19"/>
+                <w:szCs w:val="19"/>
+              </w:rPr>
+              <w:t xml:space="preserve">3</w:t>
+            </w:r>
+          </w:p>
+        </w:tc>
+        <w:tc>
+          <w:tcPr>
+            <w:tcW w:type="dxa" w:w="1600"/>
+            <w:tcMar>
+              <w:top w:type="dxa" w:w="70"/>
+              <w:left w:type="dxa" w:w="110"/>
+              <w:bottom w:type="dxa" w:w="70"/>
+              <w:right w:type="dxa" w:w="110"/>
+            </w:tcMar>
+          </w:tcPr>
+          <w:p>
+            <w:r>
+              <w:rPr>
+                <w:rFonts w:ascii="Verdana" w:cs="Verdana" w:eastAsia="Verdana" w:hAnsi="Verdana"/>
+                <w:b w:val="false"/>
+                <w:bCs w:val="false"/>
+                <w:color w:val="1F2A37"/>
+                <w:sz w:val="19"/>
+                <w:szCs w:val="19"/>
+              </w:rPr>
+              <w:t xml:space="preserve">0</w:t>
+            </w:r>
+          </w:p>
+        </w:tc>
+        <w:tc>
+          <w:tcPr>
+            <w:tcW w:type="dxa" w:w="2026"/>
+            <w:tcMar>
+              <w:top w:type="dxa" w:w="70"/>
+              <w:left w:type="dxa" w:w="110"/>
+              <w:bottom w:type="dxa" w:w="70"/>
+              <w:right w:type="dxa" w:w="110"/>
+            </w:tcMar>
+          </w:tcPr>
+          <w:p>
+            <w:r>
+              <w:rPr>
+                <w:rFonts w:ascii="Verdana" w:cs="Verdana" w:eastAsia="Verdana" w:hAnsi="Verdana"/>
+                <w:b w:val="false"/>
+                <w:bCs w:val="false"/>
+                <w:color w:val="1F2A37"/>
+                <w:sz w:val="19"/>
+                <w:szCs w:val="19"/>
+              </w:rPr>
+              <w:t xml:space="preserve">100,0%</w:t>
+            </w:r>
+          </w:p>
+        </w:tc>
+      </w:tr>
+      <w:tr>
+        <w:trPr>
+          <w:cantSplit/>
+        </w:trPr>
+        <w:tc>
+          <w:tcPr>
+            <w:tcW w:type="dxa" w:w="3800"/>
+            <w:tcMar>
+              <w:top w:type="dxa" w:w="70"/>
+              <w:left w:type="dxa" w:w="110"/>
+              <w:bottom w:type="dxa" w:w="70"/>
+              <w:right w:type="dxa" w:w="110"/>
+            </w:tcMar>
+          </w:tcPr>
+          <w:p>
+            <w:r>
+              <w:rPr>
+                <w:rFonts w:ascii="Verdana" w:cs="Verdana" w:eastAsia="Verdana" w:hAnsi="Verdana"/>
+                <w:b w:val="false"/>
+                <w:bCs w:val="false"/>
+                <w:color w:val="1F2A37"/>
+                <w:sz w:val="19"/>
+                <w:szCs w:val="19"/>
+              </w:rPr>
+              <w:t xml:space="preserve">Collegio dei revisori 2026-2030 (Presidente donna)</w:t>
+            </w:r>
+          </w:p>
+        </w:tc>
+        <w:tc>
+          <w:tcPr>
+            <w:tcW w:type="dxa" w:w="1600"/>
+            <w:tcMar>
+              <w:top w:type="dxa" w:w="70"/>
+              <w:left w:type="dxa" w:w="110"/>
+              <w:bottom w:type="dxa" w:w="70"/>
+              <w:right w:type="dxa" w:w="110"/>
+            </w:tcMar>
+          </w:tcPr>
+          <w:p>
+            <w:r>
+              <w:rPr>
+                <w:rFonts w:ascii="Verdana" w:cs="Verdana" w:eastAsia="Verdana" w:hAnsi="Verdana"/>
+                <w:b w:val="false"/>
+                <w:bCs w:val="false"/>
+                <w:color w:val="1F2A37"/>
+                <w:sz w:val="19"/>
+                <w:szCs w:val="19"/>
+              </w:rPr>
+              <w:t xml:space="preserve">2</w:t>
+            </w:r>
+          </w:p>
+        </w:tc>
+        <w:tc>
+          <w:tcPr>
+            <w:tcW w:type="dxa" w:w="1600"/>
+            <w:tcMar>
+              <w:top w:type="dxa" w:w="70"/>
+              <w:left w:type="dxa" w:w="110"/>
+              <w:bottom w:type="dxa" w:w="70"/>
+              <w:right w:type="dxa" w:w="110"/>
+            </w:tcMar>
+          </w:tcPr>
+          <w:p>
+            <w:r>
+              <w:rPr>
+                <w:rFonts w:ascii="Verdana" w:cs="Verdana" w:eastAsia="Verdana" w:hAnsi="Verdana"/>
+                <w:b w:val="false"/>
+                <w:bCs w:val="false"/>
+                <w:color w:val="1F2A37"/>
+                <w:sz w:val="19"/>
+                <w:szCs w:val="19"/>
+              </w:rPr>
+              <w:t xml:space="preserve">1</w:t>
+            </w:r>
+          </w:p>
+        </w:tc>
+        <w:tc>
+          <w:tcPr>
+            <w:tcW w:type="dxa" w:w="2026"/>
+            <w:tcMar>
+              <w:top w:type="dxa" w:w="70"/>
+              <w:left w:type="dxa" w:w="110"/>
+              <w:bottom w:type="dxa" w:w="70"/>
+              <w:right w:type="dxa" w:w="110"/>
+            </w:tcMar>
+          </w:tcPr>
+          <w:p>
+            <w:r>
+              <w:rPr>
+                <w:rFonts w:ascii="Verdana" w:cs="Verdana" w:eastAsia="Verdana" w:hAnsi="Verdana"/>
+                <w:b w:val="false"/>
+                <w:bCs w:val="false"/>
+                <w:color w:val="1F2A37"/>
+                <w:sz w:val="19"/>
+                <w:szCs w:val="19"/>
+              </w:rPr>
+              <w:t xml:space="preserve">66,7%</w:t>
+            </w:r>
+          </w:p>
+        </w:tc>
+      </w:tr>
+      <w:tr>
+        <w:trPr>
+          <w:cantSplit/>
+        </w:trPr>
+        <w:tc>
+          <w:tcPr>
+            <w:tcW w:type="dxa" w:w="3800"/>
+            <w:tcMar>
+              <w:top w:type="dxa" w:w="70"/>
+              <w:left w:type="dxa" w:w="110"/>
+              <w:bottom w:type="dxa" w:w="70"/>
+              <w:right w:type="dxa" w:w="110"/>
+            </w:tcMar>
+          </w:tcPr>
+          <w:p>
+            <w:r>
+              <w:rPr>
+                <w:rFonts w:ascii="Verdana" w:cs="Verdana" w:eastAsia="Verdana" w:hAnsi="Verdana"/>
+                <w:b w:val="false"/>
+                <w:bCs w:val="false"/>
+                <w:color w:val="1F2A37"/>
+                <w:sz w:val="19"/>
+                <w:szCs w:val="19"/>
+              </w:rPr>
+              <w:t xml:space="preserve">Commissioni 2022-2026: 3 commissioni, componenti</w:t>
+            </w:r>
+          </w:p>
+        </w:tc>
+        <w:tc>
+          <w:tcPr>
+            <w:tcW w:type="dxa" w:w="1600"/>
+            <w:tcMar>
+              <w:top w:type="dxa" w:w="70"/>
+              <w:left w:type="dxa" w:w="110"/>
+              <w:bottom w:type="dxa" w:w="70"/>
+              <w:right w:type="dxa" w:w="110"/>
+            </w:tcMar>
+          </w:tcPr>
+          <w:p>
+            <w:r>
+              <w:rPr>
+                <w:rFonts w:ascii="Verdana" w:cs="Verdana" w:eastAsia="Verdana" w:hAnsi="Verdana"/>
+                <w:b w:val="false"/>
+                <w:bCs w:val="false"/>
+                <w:color w:val="1F2A37"/>
+                <w:sz w:val="19"/>
+                <w:szCs w:val="19"/>
+              </w:rPr>
+              <w:t xml:space="preserve">12</w:t>
+            </w:r>
+          </w:p>
+        </w:tc>
+        <w:tc>
+          <w:tcPr>
+            <w:tcW w:type="dxa" w:w="1600"/>
+            <w:tcMar>
+              <w:top w:type="dxa" w:w="70"/>
+              <w:left w:type="dxa" w:w="110"/>
+              <w:bottom w:type="dxa" w:w="70"/>
+              <w:right w:type="dxa" w:w="110"/>
+            </w:tcMar>
+          </w:tcPr>
+          <w:p>
+            <w:r>
+              <w:rPr>
+                <w:rFonts w:ascii="Verdana" w:cs="Verdana" w:eastAsia="Verdana" w:hAnsi="Verdana"/>
+                <w:b w:val="false"/>
+                <w:bCs w:val="false"/>
+                <w:color w:val="1F2A37"/>
+                <w:sz w:val="19"/>
+                <w:szCs w:val="19"/>
+              </w:rPr>
+              <w:t xml:space="preserve">15</w:t>
+            </w:r>
+          </w:p>
+        </w:tc>
+        <w:tc>
+          <w:tcPr>
+            <w:tcW w:type="dxa" w:w="2026"/>
+            <w:tcMar>
+              <w:top w:type="dxa" w:w="70"/>
+              <w:left w:type="dxa" w:w="110"/>
+              <w:bottom w:type="dxa" w:w="70"/>
+              <w:right w:type="dxa" w:w="110"/>
+            </w:tcMar>
+          </w:tcPr>
+          <w:p>
+            <w:r>
+              <w:rPr>
+                <w:rFonts w:ascii="Verdana" w:cs="Verdana" w:eastAsia="Verdana" w:hAnsi="Verdana"/>
+                <w:b w:val="false"/>
+                <w:bCs w:val="false"/>
+                <w:color w:val="1F2A37"/>
+                <w:sz w:val="19"/>
+                <w:szCs w:val="19"/>
+              </w:rPr>
+              <w:t xml:space="preserve">44,4%</w:t>
+            </w:r>
+          </w:p>
+        </w:tc>
+      </w:tr>
+      <w:tr>
+        <w:trPr>
+          <w:cantSplit/>
+        </w:trPr>
+        <w:tc>
+          <w:tcPr>
+            <w:tcW w:type="dxa" w:w="3800"/>
+            <w:tcMar>
+              <w:top w:type="dxa" w:w="70"/>
+              <w:left w:type="dxa" w:w="110"/>
+              <w:bottom w:type="dxa" w:w="70"/>
+              <w:right w:type="dxa" w:w="110"/>
+            </w:tcMar>
+          </w:tcPr>
+          <w:p>
+            <w:r>
+              <w:rPr>
+                <w:rFonts w:ascii="Verdana" w:cs="Verdana" w:eastAsia="Verdana" w:hAnsi="Verdana"/>
+                <w:b w:val="false"/>
+                <w:bCs w:val="false"/>
+                <w:color w:val="1F2A37"/>
+                <w:sz w:val="19"/>
+                <w:szCs w:val="19"/>
+              </w:rPr>
+              <w:t xml:space="preserve">Commissioni 2026-2030: 4 commissioni, componenti</w:t>
+            </w:r>
+          </w:p>
+        </w:tc>
+        <w:tc>
+          <w:tcPr>
+            <w:tcW w:type="dxa" w:w="1600"/>
+            <w:tcMar>
+              <w:top w:type="dxa" w:w="70"/>
+              <w:left w:type="dxa" w:w="110"/>
+              <w:bottom w:type="dxa" w:w="70"/>
+              <w:right w:type="dxa" w:w="110"/>
+            </w:tcMar>
+          </w:tcPr>
+          <w:p>
+            <w:r>
+              <w:rPr>
+                <w:rFonts w:ascii="Verdana" w:cs="Verdana" w:eastAsia="Verdana" w:hAnsi="Verdana"/>
+                <w:b w:val="false"/>
+                <w:bCs w:val="false"/>
+                <w:color w:val="1F2A37"/>
+                <w:sz w:val="19"/>
+                <w:szCs w:val="19"/>
+              </w:rPr>
+              <w:t xml:space="preserve">19</w:t>
+            </w:r>
+          </w:p>
+        </w:tc>
+        <w:tc>
+          <w:tcPr>
+            <w:tcW w:type="dxa" w:w="1600"/>
+            <w:tcMar>
+              <w:top w:type="dxa" w:w="70"/>
+              <w:left w:type="dxa" w:w="110"/>
+              <w:bottom w:type="dxa" w:w="70"/>
+              <w:right w:type="dxa" w:w="110"/>
+            </w:tcMar>
+          </w:tcPr>
+          <w:p>
+            <w:r>
+              <w:rPr>
+                <w:rFonts w:ascii="Verdana" w:cs="Verdana" w:eastAsia="Verdana" w:hAnsi="Verdana"/>
+                <w:b w:val="false"/>
+                <w:bCs w:val="false"/>
+                <w:color w:val="1F2A37"/>
+                <w:sz w:val="19"/>
+                <w:szCs w:val="19"/>
+              </w:rPr>
+              <w:t xml:space="preserve">21</w:t>
+            </w:r>
+          </w:p>
+        </w:tc>
+        <w:tc>
+          <w:tcPr>
+            <w:tcW w:type="dxa" w:w="2026"/>
+            <w:tcMar>
+              <w:top w:type="dxa" w:w="70"/>
+              <w:left w:type="dxa" w:w="110"/>
+              <w:bottom w:type="dxa" w:w="70"/>
+              <w:right w:type="dxa" w:w="110"/>
+            </w:tcMar>
+          </w:tcPr>
+          <w:p>
+            <w:r>
+              <w:rPr>
+                <w:rFonts w:ascii="Verdana" w:cs="Verdana" w:eastAsia="Verdana" w:hAnsi="Verdana"/>
+                <w:b w:val="false"/>
+                <w:bCs w:val="false"/>
+                <w:color w:val="1F2A37"/>
+                <w:sz w:val="19"/>
+                <w:szCs w:val="19"/>
+              </w:rPr>
+              <w:t xml:space="preserve">47,5%</w:t>
+            </w:r>
+          </w:p>
+        </w:tc>
+      </w:tr>
+      <w:tr>
+        <w:trPr>
+          <w:cantSplit/>
+        </w:trPr>
+        <w:tc>
+          <w:tcPr>
+            <w:tcW w:type="dxa" w:w="3800"/>
+            <w:tcMar>
+              <w:top w:type="dxa" w:w="70"/>
+              <w:left w:type="dxa" w:w="110"/>
+              <w:bottom w:type="dxa" w:w="70"/>
+              <w:right w:type="dxa" w:w="110"/>
+            </w:tcMar>
+          </w:tcPr>
+          <w:p>
+            <w:r>
+              <w:rPr>
+                <w:rFonts w:ascii="Verdana" w:cs="Verdana" w:eastAsia="Verdana" w:hAnsi="Verdana"/>
+                <w:b w:val="false"/>
+                <w:bCs w:val="false"/>
+                <w:color w:val="1F2A37"/>
+                <w:sz w:val="19"/>
+                <w:szCs w:val="19"/>
+              </w:rPr>
+              <w:t xml:space="preserve">Presidenze delle commissioni 2022-2026</w:t>
+            </w:r>
+          </w:p>
+        </w:tc>
+        <w:tc>
+          <w:tcPr>
+            <w:tcW w:type="dxa" w:w="1600"/>
+            <w:tcMar>
+              <w:top w:type="dxa" w:w="70"/>
+              <w:left w:type="dxa" w:w="110"/>
+              <w:bottom w:type="dxa" w:w="70"/>
+              <w:right w:type="dxa" w:w="110"/>
+            </w:tcMar>
+          </w:tcPr>
+          <w:p>
+            <w:r>
+              <w:rPr>
+                <w:rFonts w:ascii="Verdana" w:cs="Verdana" w:eastAsia="Verdana" w:hAnsi="Verdana"/>
+                <w:b w:val="false"/>
+                <w:bCs w:val="false"/>
+                <w:color w:val="1F2A37"/>
+                <w:sz w:val="19"/>
+                <w:szCs w:val="19"/>
+              </w:rPr>
+              <w:t xml:space="preserve">2</w:t>
+            </w:r>
+          </w:p>
+        </w:tc>
+        <w:tc>
+          <w:tcPr>
+            <w:tcW w:type="dxa" w:w="1600"/>
+            <w:tcMar>
+              <w:top w:type="dxa" w:w="70"/>
+              <w:left w:type="dxa" w:w="110"/>
+              <w:bottom w:type="dxa" w:w="70"/>
+              <w:right w:type="dxa" w:w="110"/>
+            </w:tcMar>
+          </w:tcPr>
+          <w:p>
+            <w:r>
+              <w:rPr>
+                <w:rFonts w:ascii="Verdana" w:cs="Verdana" w:eastAsia="Verdana" w:hAnsi="Verdana"/>
+                <w:b w:val="false"/>
+                <w:bCs w:val="false"/>
+                <w:color w:val="1F2A37"/>
+                <w:sz w:val="19"/>
+                <w:szCs w:val="19"/>
+              </w:rPr>
+              <w:t xml:space="preserve">1</w:t>
+            </w:r>
+          </w:p>
+        </w:tc>
+        <w:tc>
+          <w:tcPr>
+            <w:tcW w:type="dxa" w:w="2026"/>
+            <w:tcMar>
+              <w:top w:type="dxa" w:w="70"/>
+              <w:left w:type="dxa" w:w="110"/>
+              <w:bottom w:type="dxa" w:w="70"/>
+              <w:right w:type="dxa" w:w="110"/>
+            </w:tcMar>
+          </w:tcPr>
+          <w:p>
+            <w:r>
+              <w:rPr>
+                <w:rFonts w:ascii="Verdana" w:cs="Verdana" w:eastAsia="Verdana" w:hAnsi="Verdana"/>
+                <w:b w:val="false"/>
+                <w:bCs w:val="false"/>
+                <w:color w:val="1F2A37"/>
+                <w:sz w:val="19"/>
+                <w:szCs w:val="19"/>
+              </w:rPr>
+              <w:t xml:space="preserve">66,7%</w:t>
+            </w:r>
+          </w:p>
+        </w:tc>
+      </w:tr>
+      <w:tr>
+        <w:trPr>
+          <w:cantSplit/>
+        </w:trPr>
+        <w:tc>
+          <w:tcPr>
+            <w:tcW w:type="dxa" w:w="3800"/>
+            <w:tcMar>
+              <w:top w:type="dxa" w:w="70"/>
+              <w:left w:type="dxa" w:w="110"/>
+              <w:bottom w:type="dxa" w:w="70"/>
+              <w:right w:type="dxa" w:w="110"/>
+            </w:tcMar>
+          </w:tcPr>
+          <w:p>
+            <w:r>
+              <w:rPr>
+                <w:rFonts w:ascii="Verdana" w:cs="Verdana" w:eastAsia="Verdana" w:hAnsi="Verdana"/>
+                <w:b w:val="false"/>
+                <w:bCs w:val="false"/>
+                <w:color w:val="1F2A37"/>
+                <w:sz w:val="19"/>
+                <w:szCs w:val="19"/>
+              </w:rPr>
+              <w:t xml:space="preserve">Presidenze delle commissioni 2026-2030</w:t>
+            </w:r>
+          </w:p>
+        </w:tc>
+        <w:tc>
+          <w:tcPr>
+            <w:tcW w:type="dxa" w:w="1600"/>
+            <w:tcMar>
+              <w:top w:type="dxa" w:w="70"/>
+              <w:left w:type="dxa" w:w="110"/>
+              <w:bottom w:type="dxa" w:w="70"/>
+              <w:right w:type="dxa" w:w="110"/>
+            </w:tcMar>
+          </w:tcPr>
+          <w:p>
+            <w:r>
+              <w:rPr>
+                <w:rFonts w:ascii="Verdana" w:cs="Verdana" w:eastAsia="Verdana" w:hAnsi="Verdana"/>
+                <w:b w:val="false"/>
+                <w:bCs w:val="false"/>
+                <w:color w:val="1F2A37"/>
+                <w:sz w:val="19"/>
+                <w:szCs w:val="19"/>
+              </w:rPr>
+              <w:t xml:space="preserve">1</w:t>
+            </w:r>
+          </w:p>
+        </w:tc>
+        <w:tc>
+          <w:tcPr>
+            <w:tcW w:type="dxa" w:w="1600"/>
+            <w:tcMar>
+              <w:top w:type="dxa" w:w="70"/>
+              <w:left w:type="dxa" w:w="110"/>
+              <w:bottom w:type="dxa" w:w="70"/>
+              <w:right w:type="dxa" w:w="110"/>
+            </w:tcMar>
+          </w:tcPr>
+          <w:p>
+            <w:r>
+              <w:rPr>
+                <w:rFonts w:ascii="Verdana" w:cs="Verdana" w:eastAsia="Verdana" w:hAnsi="Verdana"/>
+                <w:b w:val="false"/>
+                <w:bCs w:val="false"/>
+                <w:color w:val="1F2A37"/>
+                <w:sz w:val="19"/>
+                <w:szCs w:val="19"/>
+              </w:rPr>
+              <w:t xml:space="preserve">3</w:t>
+            </w:r>
+          </w:p>
+        </w:tc>
+        <w:tc>
+          <w:tcPr>
+            <w:tcW w:type="dxa" w:w="2026"/>
+            <w:tcMar>
+              <w:top w:type="dxa" w:w="70"/>
+              <w:left w:type="dxa" w:w="110"/>
+              <w:bottom w:type="dxa" w:w="70"/>
+              <w:right w:type="dxa" w:w="110"/>
+            </w:tcMar>
+          </w:tcPr>
+          <w:p>
+            <w:r>
+              <w:rPr>
+                <w:rFonts w:ascii="Verdana" w:cs="Verdana" w:eastAsia="Verdana" w:hAnsi="Verdana"/>
+                <w:b w:val="false"/>
+                <w:bCs w:val="false"/>
+                <w:color w:val="1F2A37"/>
+                <w:sz w:val="19"/>
+                <w:szCs w:val="19"/>
+              </w:rPr>
+              <w:t xml:space="preserve">25,0%</w:t>
             </w:r>
           </w:p>
         </w:tc>
@@ -6553,7 +8069,7 @@
           <w:sz w:val="22"/>
           <w:szCs w:val="22"/>
         </w:rPr>
-        <w:t xml:space="preserve">Nel Consiglio 2022-2025 le donne erano il 36%, dieci punti sotto la loro presenza tra gli iscritti (46%). Il Consiglio 2026-2030 è presieduto da una donna, la dott.ssa Sara Pennacchi: a livello nazionale le Presidenti di Ordine sono passate da 19 a 30 su 132.</w:t>
+        <w:t xml:space="preserve">Nel Consiglio 2022-2026 le donne erano il 36%, dieci punti sotto la loro presenza tra gli iscritti. Nel Consiglio 2026-2030 sono il 45%, in linea con l’Albo, e tre cariche su quattro sono di donne: la Presidente, dott.ssa Sara Pennacchi, la Segretaria e la Tesoriera. A livello nazionale le Presidenti di Ordine sono passate da 19 a 30 su 132.</w:t>
       </w:r>
     </w:p>
     <w:p>
@@ -6567,17 +8083,21 @@
           <w:sz w:val="22"/>
           <w:szCs w:val="22"/>
         </w:rPr>
-        <w:t xml:space="preserve">Cariche (Presidente, Vicepresidente, Segretario, Tesoriere) per genere: </w:t>
+        <w:t xml:space="preserve">Cariche 2022-2026: Presidente uomo, Vicepresidente uomo, Segretaria donna, Tesoriera donna. Cariche 2026-2030: Presidente donna, Vicepresidente uomo, Segretaria donna, Tesoriera donna.</w:t>
       </w:r>
+    </w:p>
+    <w:p>
+      <w:pPr>
+        <w:spacing w:after="140" w:line="360"/>
+      </w:pPr>
       <w:r>
         <w:rPr>
           <w:rFonts w:ascii="Verdana" w:cs="Verdana" w:eastAsia="Verdana" w:hAnsi="Verdana"/>
           <w:color w:val="1F2A37"/>
           <w:sz w:val="22"/>
           <w:szCs w:val="22"/>
-          <w:shd w:fill="FFE873" w:color="auto" w:val="clear"/>
         </w:rPr>
-        <w:t xml:space="preserve">[DA INTEGRARE: dato 3]</w:t>
+        <w:t xml:space="preserve">Negli organi di controllo e di disciplina le donne sono la maggioranza o quasi, e presiedono sia il Consiglio di disciplina sia il Collegio dei revisori. Nelle commissioni invece il quadro è diverso: le componenti sono quasi la metà, ma nel 2026-2030 tre presidenze su quattro sono andate a uomini.</w:t>
       </w:r>
     </w:p>
     <w:p>
@@ -8385,7 +9905,7 @@
                 <w:sz w:val="19"/>
                 <w:szCs w:val="19"/>
               </w:rPr>
-              <w:t xml:space="preserve">Anno</w:t>
+              <w:t xml:space="preserve"/>
             </w:r>
           </w:p>
         </w:tc>
@@ -8533,12 +10053,13 @@
             <w:r>
               <w:rPr>
                 <w:rFonts w:ascii="Verdana" w:cs="Verdana" w:eastAsia="Verdana" w:hAnsi="Verdana"/>
-                <w:color w:val="1F2A37"/>
-                <w:sz w:val="22"/>
-                <w:szCs w:val="22"/>
-                <w:shd w:fill="FFE873" w:color="auto" w:val="clear"/>
-              </w:rPr>
-              <w:t xml:space="preserve">[DA INTEGRARE: dato 4, eventi 2025]</w:t>
+                <w:b w:val="false"/>
+                <w:bCs w:val="false"/>
+                <w:color w:val="1F2A37"/>
+                <w:sz w:val="19"/>
+                <w:szCs w:val="19"/>
+              </w:rPr>
+              <w:t xml:space="preserve">2025</w:t>
             </w:r>
           </w:p>
         </w:tc>
@@ -8562,7 +10083,7 @@
                 <w:sz w:val="19"/>
                 <w:szCs w:val="19"/>
               </w:rPr>
-              <w:t xml:space="preserve">…</w:t>
+              <w:t xml:space="preserve">51</w:t>
             </w:r>
           </w:p>
         </w:tc>
@@ -8586,7 +10107,7 @@
                 <w:sz w:val="19"/>
                 <w:szCs w:val="19"/>
               </w:rPr>
-              <w:t xml:space="preserve">…</w:t>
+              <w:t xml:space="preserve">74</w:t>
             </w:r>
           </w:p>
         </w:tc>
@@ -8610,7 +10131,7 @@
                 <w:sz w:val="19"/>
                 <w:szCs w:val="19"/>
               </w:rPr>
-              <w:t xml:space="preserve">…</w:t>
+              <w:t xml:space="preserve">193</w:t>
             </w:r>
           </w:p>
         </w:tc>
@@ -8634,7 +10155,7 @@
                 <w:sz w:val="19"/>
                 <w:szCs w:val="19"/>
               </w:rPr>
-              <w:t xml:space="preserve">…</w:t>
+              <w:t xml:space="preserve">27,7%</w:t>
             </w:r>
           </w:p>
         </w:tc>
@@ -8658,12 +10179,26 @@
                 <w:sz w:val="19"/>
                 <w:szCs w:val="19"/>
               </w:rPr>
-              <w:t xml:space="preserve">…</w:t>
+              <w:t xml:space="preserve">12 (di cui 3 con almeno 3 relatori)</w:t>
             </w:r>
           </w:p>
         </w:tc>
       </w:tr>
     </w:tbl>
+    <w:p>
+      <w:pPr>
+        <w:spacing w:after="140" w:line="360"/>
+      </w:pPr>
+      <w:r>
+        <w:rPr>
+          <w:rFonts w:ascii="Verdana" w:cs="Verdana" w:eastAsia="Verdana" w:hAnsi="Verdana"/>
+          <w:color w:val="1F2A37"/>
+          <w:sz w:val="22"/>
+          <w:szCs w:val="22"/>
+        </w:rPr>
+        <w:t xml:space="preserve">Su 267 interventi di relatori, 74 sono di donne: poco più di uno su quattro, contro il 46% di donne tra gli iscritti. In 12 eventi su 51 hanno parlato solo uomini, mai il contrario.</w:t>
+      </w:r>
+    </w:p>
     <w:p>
       <w:pPr>
         <w:pStyle w:val="Heading2"/>
@@ -9315,6 +10850,20 @@
           <w:szCs w:val="25"/>
         </w:rPr>
         <w:t xml:space="preserve">OCC Romagna</w:t>
+      </w:r>
+    </w:p>
+    <w:p>
+      <w:pPr>
+        <w:spacing w:after="140" w:line="360"/>
+      </w:pPr>
+      <w:r>
+        <w:rPr>
+          <w:rFonts w:ascii="Verdana" w:cs="Verdana" w:eastAsia="Verdana" w:hAnsi="Verdana"/>
+          <w:color w:val="1F2A37"/>
+          <w:sz w:val="22"/>
+          <w:szCs w:val="22"/>
+        </w:rPr>
+        <w:t xml:space="preserve">Il 19/10 è arrivato il modulo predisposto per l’OCC Romagna, ancora vuoto: i dati non sono stati compilati.</w:t>
       </w:r>
     </w:p>
     <w:tbl>
@@ -10443,12 +11992,13 @@
             <w:r>
               <w:rPr>
                 <w:rFonts w:ascii="Verdana" w:cs="Verdana" w:eastAsia="Verdana" w:hAnsi="Verdana"/>
-                <w:color w:val="1F2A37"/>
-                <w:sz w:val="22"/>
-                <w:szCs w:val="22"/>
-                <w:shd w:fill="FFE873" w:color="auto" w:val="clear"/>
-              </w:rPr>
-              <w:t xml:space="preserve">[DA INTEGRARE: dato 4]</w:t>
+                <w:b w:val="false"/>
+                <w:bCs w:val="false"/>
+                <w:color w:val="1F2A37"/>
+                <w:sz w:val="19"/>
+                <w:szCs w:val="19"/>
+              </w:rPr>
+              <w:t xml:space="preserve">27,7%</w:t>
             </w:r>
           </w:p>
         </w:tc>
@@ -10543,12 +12093,13 @@
             <w:r>
               <w:rPr>
                 <w:rFonts w:ascii="Verdana" w:cs="Verdana" w:eastAsia="Verdana" w:hAnsi="Verdana"/>
-                <w:color w:val="1F2A37"/>
-                <w:sz w:val="22"/>
-                <w:szCs w:val="22"/>
-                <w:shd w:fill="FFE873" w:color="auto" w:val="clear"/>
-              </w:rPr>
-              <w:t xml:space="preserve">[DA INTEGRARE: dato 4]</w:t>
+                <w:b w:val="false"/>
+                <w:bCs w:val="false"/>
+                <w:color w:val="1F2A37"/>
+                <w:sz w:val="19"/>
+                <w:szCs w:val="19"/>
+              </w:rPr>
+              <w:t xml:space="preserve">12 su 51</w:t>
             </w:r>
           </w:p>
         </w:tc>
@@ -10572,7 +12123,108 @@
                 <w:sz w:val="19"/>
                 <w:szCs w:val="19"/>
               </w:rPr>
-              <w:t xml:space="preserve">0</w:t>
+              <w:t xml:space="preserve">0 tra gli eventi con 3 o più relatori</w:t>
+            </w:r>
+          </w:p>
+        </w:tc>
+      </w:tr>
+      <w:tr>
+        <w:trPr>
+          <w:cantSplit/>
+        </w:trPr>
+        <w:tc>
+          <w:tcPr>
+            <w:tcW w:type="dxa" w:w="2300"/>
+            <w:tcMar>
+              <w:top w:type="dxa" w:w="70"/>
+              <w:left w:type="dxa" w:w="110"/>
+              <w:bottom w:type="dxa" w:w="70"/>
+              <w:right w:type="dxa" w:w="110"/>
+            </w:tcMar>
+          </w:tcPr>
+          <w:p>
+            <w:r>
+              <w:rPr>
+                <w:rFonts w:ascii="Verdana" w:cs="Verdana" w:eastAsia="Verdana" w:hAnsi="Verdana"/>
+                <w:b w:val="false"/>
+                <w:bCs w:val="false"/>
+                <w:color w:val="1F2A37"/>
+                <w:sz w:val="19"/>
+                <w:szCs w:val="19"/>
+              </w:rPr>
+              <w:t xml:space="preserve">Presidenze delle commissioni</w:t>
+            </w:r>
+          </w:p>
+        </w:tc>
+        <w:tc>
+          <w:tcPr>
+            <w:tcW w:type="dxa" w:w="2700"/>
+            <w:tcMar>
+              <w:top w:type="dxa" w:w="70"/>
+              <w:left w:type="dxa" w:w="110"/>
+              <w:bottom w:type="dxa" w:w="70"/>
+              <w:right w:type="dxa" w:w="110"/>
+            </w:tcMar>
+          </w:tcPr>
+          <w:p>
+            <w:r>
+              <w:rPr>
+                <w:rFonts w:ascii="Verdana" w:cs="Verdana" w:eastAsia="Verdana" w:hAnsi="Verdana"/>
+                <w:b w:val="false"/>
+                <w:bCs w:val="false"/>
+                <w:color w:val="1F2A37"/>
+                <w:sz w:val="19"/>
+                <w:szCs w:val="19"/>
+              </w:rPr>
+              <w:t xml:space="preserve">Commissioni presiedute da donne</w:t>
+            </w:r>
+          </w:p>
+        </w:tc>
+        <w:tc>
+          <w:tcPr>
+            <w:tcW w:type="dxa" w:w="2000"/>
+            <w:tcMar>
+              <w:top w:type="dxa" w:w="70"/>
+              <w:left w:type="dxa" w:w="110"/>
+              <w:bottom w:type="dxa" w:w="70"/>
+              <w:right w:type="dxa" w:w="110"/>
+            </w:tcMar>
+          </w:tcPr>
+          <w:p>
+            <w:r>
+              <w:rPr>
+                <w:rFonts w:ascii="Verdana" w:cs="Verdana" w:eastAsia="Verdana" w:hAnsi="Verdana"/>
+                <w:b w:val="false"/>
+                <w:bCs w:val="false"/>
+                <w:color w:val="1F2A37"/>
+                <w:sz w:val="19"/>
+                <w:szCs w:val="19"/>
+              </w:rPr>
+              <w:t xml:space="preserve">1 su 4</w:t>
+            </w:r>
+          </w:p>
+        </w:tc>
+        <w:tc>
+          <w:tcPr>
+            <w:tcW w:type="dxa" w:w="2026"/>
+            <w:tcMar>
+              <w:top w:type="dxa" w:w="70"/>
+              <w:left w:type="dxa" w:w="110"/>
+              <w:bottom w:type="dxa" w:w="70"/>
+              <w:right w:type="dxa" w:w="110"/>
+            </w:tcMar>
+          </w:tcPr>
+          <w:p>
+            <w:r>
+              <w:rPr>
+                <w:rFonts w:ascii="Verdana" w:cs="Verdana" w:eastAsia="Verdana" w:hAnsi="Verdana"/>
+                <w:b w:val="false"/>
+                <w:bCs w:val="false"/>
+                <w:color w:val="1F2A37"/>
+                <w:sz w:val="19"/>
+                <w:szCs w:val="19"/>
+              </w:rPr>
+              <w:t xml:space="preserve">almeno 2 su 4 al prossimo rinnovo</w:t>
             </w:r>
           </w:p>
         </w:tc>
@@ -11292,7 +12944,7 @@
                 <w:sz w:val="19"/>
                 <w:szCs w:val="19"/>
               </w:rPr>
-              <w:t xml:space="preserve">ricevuto 12/10, da inserire</w:t>
+              <w:t xml:space="preserve">inserito</w:t>
             </w:r>
           </w:p>
         </w:tc>
@@ -11393,7 +13045,7 @@
                 <w:sz w:val="19"/>
                 <w:szCs w:val="19"/>
               </w:rPr>
-              <w:t xml:space="preserve">ricevuto 12/10, da inserire</w:t>
+              <w:t xml:space="preserve">inserito</w:t>
             </w:r>
           </w:p>
         </w:tc>
@@ -11494,7 +13146,7 @@
                 <w:sz w:val="19"/>
                 <w:szCs w:val="19"/>
               </w:rPr>
-              <w:t xml:space="preserve">ricevuto 12/10, da inserire</w:t>
+              <w:t xml:space="preserve">inserito</w:t>
             </w:r>
           </w:p>
         </w:tc>
@@ -11595,7 +13247,7 @@
                 <w:sz w:val="19"/>
                 <w:szCs w:val="19"/>
               </w:rPr>
-              <w:t xml:space="preserve">ricevuto 12/10, da inserire</w:t>
+              <w:t xml:space="preserve">inserito</w:t>
             </w:r>
           </w:p>
         </w:tc>

</xml_diff>

<commit_message>
Bilancio di genere 2025: Tribunale non concede i dati, nota nel bilancio
Co-Authored-By: Claude Opus 5.5 <noreply@anthropic.com>
Claude-Session: https://claude.ai/code/session_01NPYDoU6nrtRE59is9BWqYg
</commit_message>
<xml_diff>
--- a/bilancio-genere-forli/bilancio-2025/Bilancio_di_genere_2025_ODCEC_Forli_BOZZA.docx
+++ b/bilancio-genere-forli/bilancio-2025/Bilancio_di_genere_2025_ODCEC_Forli_BOZZA.docx
@@ -1096,7 +1096,7 @@
                 <w:szCs w:val="22"/>
                 <w:shd w:fill="FFE873" w:color="auto" w:val="clear"/>
               </w:rPr>
-              <w:t xml:space="preserve">[DA INTEGRARE: Cassa Ragionieri, Tribunale, OCC, Camera di Commercio, spese]</w:t>
+              <w:t xml:space="preserve">[DA INTEGRARE: Cassa Ragionieri, OCC, Camera di Commercio, spese]</w:t>
             </w:r>
           </w:p>
         </w:tc>
@@ -10589,7 +10589,7 @@
           <w:sz w:val="22"/>
           <w:szCs w:val="22"/>
         </w:rPr>
-        <w:t xml:space="preserve">Le Linee guida suggeriscono di guardare oltre l’Albo: chi riceve gli incarichi dal Tribunale e dagli organismi di composizione della crisi, chi siede nei collegi sindacali delle imprese. Pochi Ordini lo fanno (Reggio Emilia, Venezia, Parma). Noi aggiungiamo, dove possibile, anche il valore degli incarichi e non solo il numero.</w:t>
+        <w:t xml:space="preserve">Le Linee guida suggeriscono di guardare oltre l’Albo: chi riceve gli incarichi dal Tribunale e dagli organismi di composizione della crisi, chi siede nei collegi sindacali delle imprese. Pochi Ordini lo fanno (Reggio Emilia, Venezia, Parma). Abbiamo chiesto i dati al Tribunale, all’OCC Romagna e alla Camera di Commercio, anche con il valore degli incarichi e non solo il numero.</w:t>
       </w:r>
     </w:p>
     <w:p>
@@ -10610,230 +10610,20 @@
         <w:t xml:space="preserve">Tribunale di Forlì</w:t>
       </w:r>
     </w:p>
-    <w:tbl>
-      <w:tblPr>
-        <w:tblW w:type="dxa" w:w="9026"/>
-        <w:tblBorders>
-          <w:top w:val="single" w:color="auto" w:sz="4"/>
-          <w:left w:val="single" w:color="auto" w:sz="4"/>
-          <w:bottom w:val="single" w:color="auto" w:sz="4"/>
-          <w:right w:val="single" w:color="auto" w:sz="4"/>
-          <w:insideH w:val="single" w:color="auto" w:sz="4"/>
-          <w:insideV w:val="single" w:color="auto" w:sz="4"/>
-        </w:tblBorders>
-      </w:tblPr>
-      <w:tblGrid>
-        <w:gridCol w:w="3800"/>
-        <w:gridCol w:w="1600"/>
-        <w:gridCol w:w="1600"/>
-        <w:gridCol w:w="2026"/>
-      </w:tblGrid>
-      <w:tr>
-        <w:trPr>
-          <w:tblHeader/>
-        </w:trPr>
-        <w:tc>
-          <w:tcPr>
-            <w:tcW w:type="dxa" w:w="3800"/>
-            <w:shd w:fill="DCE7F2" w:color="auto" w:val="clear"/>
-            <w:tcMar>
-              <w:top w:type="dxa" w:w="70"/>
-              <w:left w:type="dxa" w:w="110"/>
-              <w:bottom w:type="dxa" w:w="70"/>
-              <w:right w:type="dxa" w:w="110"/>
-            </w:tcMar>
-          </w:tcPr>
-          <w:p>
-            <w:r>
-              <w:rPr>
-                <w:rFonts w:ascii="Verdana" w:cs="Verdana" w:eastAsia="Verdana" w:hAnsi="Verdana"/>
-                <w:b/>
-                <w:bCs/>
-                <w:color w:val="1F2A37"/>
-                <w:sz w:val="19"/>
-                <w:szCs w:val="19"/>
-              </w:rPr>
-              <w:t xml:space="preserve">Tipo di incarico 2021-2025</w:t>
-            </w:r>
-          </w:p>
-        </w:tc>
-        <w:tc>
-          <w:tcPr>
-            <w:tcW w:type="dxa" w:w="1600"/>
-            <w:shd w:fill="DCE7F2" w:color="auto" w:val="clear"/>
-            <w:tcMar>
-              <w:top w:type="dxa" w:w="70"/>
-              <w:left w:type="dxa" w:w="110"/>
-              <w:bottom w:type="dxa" w:w="70"/>
-              <w:right w:type="dxa" w:w="110"/>
-            </w:tcMar>
-          </w:tcPr>
-          <w:p>
-            <w:r>
-              <w:rPr>
-                <w:rFonts w:ascii="Verdana" w:cs="Verdana" w:eastAsia="Verdana" w:hAnsi="Verdana"/>
-                <w:b/>
-                <w:bCs/>
-                <w:color w:val="1F2A37"/>
-                <w:sz w:val="19"/>
-                <w:szCs w:val="19"/>
-              </w:rPr>
-              <w:t xml:space="preserve">Donne</w:t>
-            </w:r>
-          </w:p>
-        </w:tc>
-        <w:tc>
-          <w:tcPr>
-            <w:tcW w:type="dxa" w:w="1600"/>
-            <w:shd w:fill="DCE7F2" w:color="auto" w:val="clear"/>
-            <w:tcMar>
-              <w:top w:type="dxa" w:w="70"/>
-              <w:left w:type="dxa" w:w="110"/>
-              <w:bottom w:type="dxa" w:w="70"/>
-              <w:right w:type="dxa" w:w="110"/>
-            </w:tcMar>
-          </w:tcPr>
-          <w:p>
-            <w:r>
-              <w:rPr>
-                <w:rFonts w:ascii="Verdana" w:cs="Verdana" w:eastAsia="Verdana" w:hAnsi="Verdana"/>
-                <w:b/>
-                <w:bCs/>
-                <w:color w:val="1F2A37"/>
-                <w:sz w:val="19"/>
-                <w:szCs w:val="19"/>
-              </w:rPr>
-              <w:t xml:space="preserve">Uomini</w:t>
-            </w:r>
-          </w:p>
-        </w:tc>
-        <w:tc>
-          <w:tcPr>
-            <w:tcW w:type="dxa" w:w="2026"/>
-            <w:shd w:fill="DCE7F2" w:color="auto" w:val="clear"/>
-            <w:tcMar>
-              <w:top w:type="dxa" w:w="70"/>
-              <w:left w:type="dxa" w:w="110"/>
-              <w:bottom w:type="dxa" w:w="70"/>
-              <w:right w:type="dxa" w:w="110"/>
-            </w:tcMar>
-          </w:tcPr>
-          <w:p>
-            <w:r>
-              <w:rPr>
-                <w:rFonts w:ascii="Verdana" w:cs="Verdana" w:eastAsia="Verdana" w:hAnsi="Verdana"/>
-                <w:b/>
-                <w:bCs/>
-                <w:color w:val="1F2A37"/>
-                <w:sz w:val="19"/>
-                <w:szCs w:val="19"/>
-              </w:rPr>
-              <w:t xml:space="preserve">% donne</w:t>
-            </w:r>
-          </w:p>
-        </w:tc>
-      </w:tr>
-      <w:tr>
-        <w:trPr>
-          <w:cantSplit/>
-        </w:trPr>
-        <w:tc>
-          <w:tcPr>
-            <w:tcW w:type="dxa" w:w="3800"/>
-            <w:tcMar>
-              <w:top w:type="dxa" w:w="70"/>
-              <w:left w:type="dxa" w:w="110"/>
-              <w:bottom w:type="dxa" w:w="70"/>
-              <w:right w:type="dxa" w:w="110"/>
-            </w:tcMar>
-          </w:tcPr>
-          <w:p>
-            <w:r>
-              <w:rPr>
-                <w:rFonts w:ascii="Verdana" w:cs="Verdana" w:eastAsia="Verdana" w:hAnsi="Verdana"/>
-                <w:color w:val="1F2A37"/>
-                <w:sz w:val="22"/>
-                <w:szCs w:val="22"/>
-                <w:shd w:fill="FFE873" w:color="auto" w:val="clear"/>
-              </w:rPr>
-              <w:t xml:space="preserve">[DA INTEGRARE: dato 9: curatele, liquidazioni, CTU, custodie, delegati alle vendite]</w:t>
-            </w:r>
-          </w:p>
-        </w:tc>
-        <w:tc>
-          <w:tcPr>
-            <w:tcW w:type="dxa" w:w="1600"/>
-            <w:tcMar>
-              <w:top w:type="dxa" w:w="70"/>
-              <w:left w:type="dxa" w:w="110"/>
-              <w:bottom w:type="dxa" w:w="70"/>
-              <w:right w:type="dxa" w:w="110"/>
-            </w:tcMar>
-          </w:tcPr>
-          <w:p>
-            <w:r>
-              <w:rPr>
-                <w:rFonts w:ascii="Verdana" w:cs="Verdana" w:eastAsia="Verdana" w:hAnsi="Verdana"/>
-                <w:b w:val="false"/>
-                <w:bCs w:val="false"/>
-                <w:color w:val="1F2A37"/>
-                <w:sz w:val="19"/>
-                <w:szCs w:val="19"/>
-              </w:rPr>
-              <w:t xml:space="preserve">…</w:t>
-            </w:r>
-          </w:p>
-        </w:tc>
-        <w:tc>
-          <w:tcPr>
-            <w:tcW w:type="dxa" w:w="1600"/>
-            <w:tcMar>
-              <w:top w:type="dxa" w:w="70"/>
-              <w:left w:type="dxa" w:w="110"/>
-              <w:bottom w:type="dxa" w:w="70"/>
-              <w:right w:type="dxa" w:w="110"/>
-            </w:tcMar>
-          </w:tcPr>
-          <w:p>
-            <w:r>
-              <w:rPr>
-                <w:rFonts w:ascii="Verdana" w:cs="Verdana" w:eastAsia="Verdana" w:hAnsi="Verdana"/>
-                <w:b w:val="false"/>
-                <w:bCs w:val="false"/>
-                <w:color w:val="1F2A37"/>
-                <w:sz w:val="19"/>
-                <w:szCs w:val="19"/>
-              </w:rPr>
-              <w:t xml:space="preserve">…</w:t>
-            </w:r>
-          </w:p>
-        </w:tc>
-        <w:tc>
-          <w:tcPr>
-            <w:tcW w:type="dxa" w:w="2026"/>
-            <w:tcMar>
-              <w:top w:type="dxa" w:w="70"/>
-              <w:left w:type="dxa" w:w="110"/>
-              <w:bottom w:type="dxa" w:w="70"/>
-              <w:right w:type="dxa" w:w="110"/>
-            </w:tcMar>
-          </w:tcPr>
-          <w:p>
-            <w:r>
-              <w:rPr>
-                <w:rFonts w:ascii="Verdana" w:cs="Verdana" w:eastAsia="Verdana" w:hAnsi="Verdana"/>
-                <w:b w:val="false"/>
-                <w:bCs w:val="false"/>
-                <w:color w:val="1F2A37"/>
-                <w:sz w:val="19"/>
-                <w:szCs w:val="19"/>
-              </w:rPr>
-              <w:t xml:space="preserve">…</w:t>
-            </w:r>
-          </w:p>
-        </w:tc>
-      </w:tr>
-    </w:tbl>
+    <w:p>
+      <w:pPr>
+        <w:spacing w:after="140" w:line="360"/>
+      </w:pPr>
+      <w:r>
+        <w:rPr>
+          <w:rFonts w:ascii="Verdana" w:cs="Verdana" w:eastAsia="Verdana" w:hAnsi="Verdana"/>
+          <w:color w:val="1F2A37"/>
+          <w:sz w:val="22"/>
+          <w:szCs w:val="22"/>
+        </w:rPr>
+        <w:t xml:space="preserve">Il 12 ottobre 2026 abbiamo chiesto al Tribunale di Forlì gli incarichi 2021-2025 conferiti a commercialisti, per genere e tipo (procedure concorsuali, esecuzioni, volontaria giurisdizione). Il Tribunale non ha concesso i dati. La rilevazione resta tra gli obiettivi dei prossimi bilanci, anche con altre fonti.</w:t>
+      </w:r>
+    </w:p>
     <w:p>
       <w:pPr>
         <w:pStyle w:val="Heading2"/>
@@ -13752,7 +13542,7 @@
                 <w:sz w:val="19"/>
                 <w:szCs w:val="19"/>
               </w:rPr>
-              <w:t xml:space="preserve">in attesa</w:t>
+              <w:t xml:space="preserve">non concessi</w:t>
             </w:r>
           </w:p>
         </w:tc>

</xml_diff>